<commit_message>
Remplacement fichier JSON par API Open Agenda - mise à jour README
</commit_message>
<xml_diff>
--- a/Bouyakhsass_Sajid_2_rapport_062026.docx
+++ b/Bouyakhsass_Sajid_2_rapport_062026.docx
@@ -2,6 +2,51 @@
 <file path=word/document.xml><?xml version="1.0" encoding="utf-8"?>
 <w:document xmlns:wpc="http://schemas.microsoft.com/office/word/2010/wordprocessingCanvas" xmlns:cx="http://schemas.microsoft.com/office/drawing/2014/chartex" xmlns:cx1="http://schemas.microsoft.com/office/drawing/2015/9/8/chartex" xmlns:cx2="http://schemas.microsoft.com/office/drawing/2015/10/21/chartex" xmlns:cx3="http://schemas.microsoft.com/office/drawing/2016/5/9/chartex" xmlns:cx4="http://schemas.microsoft.com/office/drawing/2016/5/10/chartex" xmlns:cx5="http://schemas.microsoft.com/office/drawing/2016/5/11/chartex" xmlns:cx6="http://schemas.microsoft.com/office/drawing/2016/5/12/chartex" xmlns:cx7="http://schemas.microsoft.com/office/drawing/2016/5/13/chartex" xmlns:cx8="http://schemas.microsoft.com/office/drawing/2016/5/14/chartex" xmlns:mc="http://schemas.openxmlformats.org/markup-compatibility/2006" xmlns:aink="http://schemas.microsoft.com/office/drawing/2016/ink" xmlns:am3d="http://schemas.microsoft.com/office/drawing/2017/model3d" xmlns:o="urn:schemas-microsoft-com:office:office" xmlns:r="http://schemas.openxmlformats.org/officeDocument/2006/relationships" xmlns:m="http://schemas.openxmlformats.org/officeDocument/2006/math" xmlns:v="urn:schemas-microsoft-com:vml" xmlns:wp14="http://schemas.microsoft.com/office/word/2010/wordprocessingDrawing" xmlns:wp="http://schemas.openxmlformats.org/drawingml/2006/wordprocessingDrawing" xmlns:w10="urn:schemas-microsoft-com:office:word" xmlns:w="http://schemas.openxmlformats.org/wordprocessingml/2006/main" xmlns:w14="http://schemas.microsoft.com/office/word/2010/wordml" xmlns:w15="http://schemas.microsoft.com/office/word/2012/wordml" xmlns:w16cex="http://schemas.microsoft.com/office/word/2018/wordml/cex" xmlns:w16cid="http://schemas.microsoft.com/office/word/2016/wordml/cid" xmlns:w16="http://schemas.microsoft.com/office/word/2018/wordml" xmlns:w16sdtdh="http://schemas.microsoft.com/office/word/2020/wordml/sdtdatahash" xmlns:w16se="http://schemas.microsoft.com/office/word/2015/wordml/symex" xmlns:wpg="http://schemas.microsoft.com/office/word/2010/wordprocessingGroup" xmlns:wpi="http://schemas.microsoft.com/office/word/2010/wordprocessingInk" xmlns:wne="http://schemas.microsoft.com/office/word/2006/wordml" xmlns:wps="http://schemas.microsoft.com/office/word/2010/wordprocessingShape" mc:Ignorable="w14 w15 w16se w16cid w16 w16cex w16sdtdh wp14">
   <w:body>
+    <w:p>
+      <w:pPr>
+        <w:spacing w:before="100" w:after="100"/>
+      </w:pPr>
+    </w:p>
+    <w:p>
+      <w:pPr>
+        <w:spacing w:before="100" w:after="100"/>
+      </w:pPr>
+    </w:p>
+    <w:p>
+      <w:pPr>
+        <w:spacing w:before="100" w:after="100"/>
+      </w:pPr>
+    </w:p>
+    <w:p>
+      <w:pPr>
+        <w:spacing w:before="100" w:after="100"/>
+      </w:pPr>
+    </w:p>
+    <w:p>
+      <w:pPr>
+        <w:spacing w:before="100" w:after="100"/>
+      </w:pPr>
+    </w:p>
+    <w:p>
+      <w:pPr>
+        <w:spacing w:before="100" w:after="100"/>
+      </w:pPr>
+    </w:p>
+    <w:p>
+      <w:pPr>
+        <w:spacing w:before="100" w:after="100"/>
+      </w:pPr>
+    </w:p>
+    <w:p>
+      <w:pPr>
+        <w:spacing w:before="100" w:after="100"/>
+      </w:pPr>
+    </w:p>
+    <w:p>
+      <w:pPr>
+        <w:spacing w:before="100" w:after="100"/>
+      </w:pPr>
+    </w:p>
     <w:p>
       <w:pPr>
         <w:spacing w:before="100" w:after="100"/>
@@ -114,7 +159,13 @@
         <w:rPr>
           <w:color w:val="666666"/>
         </w:rPr>
-        <w:t>Janvier 202</w:t>
+        <w:t xml:space="preserve">JUIN </w:t>
+      </w:r>
+      <w:r>
+        <w:rPr>
+          <w:color w:val="666666"/>
+        </w:rPr>
+        <w:t>202</w:t>
       </w:r>
       <w:r>
         <w:rPr>
@@ -206,42 +257,6 @@
       </w:pPr>
       <w:r>
         <w:t>1.2 Objectifs du POC</w:t>
-      </w:r>
-    </w:p>
-    <w:p>
-      <w:pPr>
-        <w:spacing w:before="100" w:after="100"/>
-        <w:jc w:val="both"/>
-      </w:pPr>
-      <w:r>
-        <w:t>Ce Proof of Concept vise à démontrer la faisabilité d'un système RAG (</w:t>
-      </w:r>
-      <w:proofErr w:type="spellStart"/>
-      <w:r>
-        <w:t>Retrieval</w:t>
-      </w:r>
-      <w:proofErr w:type="spellEnd"/>
-      <w:r>
-        <w:t xml:space="preserve"> </w:t>
-      </w:r>
-      <w:proofErr w:type="spellStart"/>
-      <w:r>
-        <w:t>Augmented</w:t>
-      </w:r>
-      <w:proofErr w:type="spellEnd"/>
-      <w:r>
-        <w:t xml:space="preserve"> </w:t>
-      </w:r>
-      <w:proofErr w:type="spellStart"/>
-      <w:r>
-        <w:t>Generation</w:t>
-      </w:r>
-      <w:proofErr w:type="spellEnd"/>
-      <w:r>
-        <w:t>) pour la recommandation d'év</w:t>
-      </w:r>
-      <w:r>
-        <w:t>énements culturels. Les objectifs sont les suivants :</w:t>
       </w:r>
     </w:p>
     <w:p>
@@ -254,7 +269,7 @@
         <w:spacing w:before="60" w:after="60"/>
       </w:pPr>
       <w:r>
-        <w:t>Récupérer et nettoyer les données d'événements culturels de la Gironde depuis Open Agenda</w:t>
+        <w:t>Récupérer les données d'événements culturels de la Gironde via l'API Open Agenda</w:t>
       </w:r>
     </w:p>
     <w:p>
@@ -267,7 +282,10 @@
         <w:spacing w:before="60" w:after="60"/>
       </w:pPr>
       <w:r>
-        <w:t>Créer une base de données vectorielle FAISS pour la recherche sémantique</w:t>
+        <w:t>Nettoyer et préparer les données pour la vectori</w:t>
+      </w:r>
+      <w:r>
+        <w:t>sation</w:t>
       </w:r>
     </w:p>
     <w:p>
@@ -280,18 +298,7 @@
         <w:spacing w:before="60" w:after="60"/>
       </w:pPr>
       <w:r>
-        <w:t xml:space="preserve">Développer un </w:t>
-      </w:r>
-      <w:proofErr w:type="spellStart"/>
-      <w:r>
-        <w:t>chatbot</w:t>
-      </w:r>
-      <w:proofErr w:type="spellEnd"/>
-      <w:r>
-        <w:t xml:space="preserve"> capable de répond</w:t>
-      </w:r>
-      <w:r>
-        <w:t>re aux questions sur les événements culturels</w:t>
+        <w:t>Créer une base de données vectorielle FAISS pour la recherche sémantique</w:t>
       </w:r>
     </w:p>
     <w:p>
@@ -304,92 +311,15 @@
         <w:spacing w:before="60" w:after="60"/>
       </w:pPr>
       <w:r>
-        <w:t>Évaluer la qualité des réponses du système RAG</w:t>
-      </w:r>
-    </w:p>
-    <w:p>
-      <w:pPr>
-        <w:spacing w:before="100" w:after="100"/>
-      </w:pPr>
-    </w:p>
-    <w:p>
-      <w:pPr>
-        <w:pStyle w:val="Titre2"/>
-      </w:pPr>
-      <w:r>
-        <w:t>1.3 Périmètre géographique</w:t>
-      </w:r>
-    </w:p>
-    <w:p>
-      <w:pPr>
-        <w:spacing w:before="100" w:after="100"/>
-        <w:jc w:val="both"/>
-      </w:pPr>
-      <w:r>
-        <w:t>Le périmètre géographique retenu pour ce POC est le département de la Gironde (33), en région Nouvelle-Aquitaine. Les données couvrent les événements de moins d'un an, conformément aux exigences du cahier des charges.</w:t>
-      </w:r>
-    </w:p>
-    <w:p>
-      <w:pPr>
-        <w:spacing w:before="100" w:after="100"/>
-      </w:pPr>
-    </w:p>
-    <w:p>
-      <w:r>
-        <w:br w:type="page"/>
-      </w:r>
-    </w:p>
-    <w:p>
-      <w:pPr>
-        <w:pStyle w:val="Titre1"/>
-      </w:pPr>
-      <w:r>
-        <w:lastRenderedPageBreak/>
-        <w:t>2. Architecture du système RAG</w:t>
-      </w:r>
-    </w:p>
-    <w:p>
-      <w:pPr>
-        <w:pStyle w:val="Titre2"/>
-      </w:pPr>
-      <w:r>
-        <w:t xml:space="preserve">2.1 </w:t>
-      </w:r>
-      <w:r>
-        <w:t>Qu'est-ce que le RAG ?</w:t>
-      </w:r>
-    </w:p>
-    <w:p>
-      <w:pPr>
-        <w:spacing w:before="100" w:after="100"/>
-        <w:jc w:val="both"/>
-      </w:pPr>
-      <w:r>
-        <w:t>Le RAG (</w:t>
+        <w:t xml:space="preserve">Développer un </w:t>
       </w:r>
       <w:proofErr w:type="spellStart"/>
       <w:r>
-        <w:t>Retrieval</w:t>
+        <w:t>chatbot</w:t>
       </w:r>
       <w:proofErr w:type="spellEnd"/>
       <w:r>
-        <w:t xml:space="preserve"> </w:t>
-      </w:r>
-      <w:proofErr w:type="spellStart"/>
-      <w:r>
-        <w:t>Augmented</w:t>
-      </w:r>
-      <w:proofErr w:type="spellEnd"/>
-      <w:r>
-        <w:t xml:space="preserve"> </w:t>
-      </w:r>
-      <w:proofErr w:type="spellStart"/>
-      <w:r>
-        <w:t>Generation</w:t>
-      </w:r>
-      <w:proofErr w:type="spellEnd"/>
-      <w:r>
-        <w:t>) est une architecture qui combine deux composants principaux :</w:t>
+        <w:t xml:space="preserve"> capable de répondre aux questions sur les événements culturels</w:t>
       </w:r>
     </w:p>
     <w:p>
@@ -401,13 +331,93 @@
         </w:numPr>
         <w:spacing w:before="60" w:after="60"/>
       </w:pPr>
+      <w:r>
+        <w:t>Évaluer la qualité des réponses du système RAG</w:t>
+      </w:r>
+    </w:p>
+    <w:p>
+      <w:pPr>
+        <w:spacing w:before="100" w:after="100"/>
+      </w:pPr>
+    </w:p>
+    <w:p>
+      <w:pPr>
+        <w:pStyle w:val="Titre2"/>
+      </w:pPr>
+      <w:r>
+        <w:t>1.3 Périmètre géographique</w:t>
+      </w:r>
+    </w:p>
+    <w:p>
+      <w:pPr>
+        <w:spacing w:before="100" w:after="100"/>
+        <w:jc w:val="both"/>
+      </w:pPr>
+      <w:r>
+        <w:t>Le périmètre géographique retenu pour ce POC est le département de la Gironde (33), en région Nouvelle-Aquitaine. Les données couvrent les événements de moins d'un an, conformément aux exigences du cahier des charges.</w:t>
+      </w:r>
+    </w:p>
+    <w:p>
+      <w:pPr>
+        <w:spacing w:before="100" w:after="100"/>
+      </w:pPr>
+    </w:p>
+    <w:p>
+      <w:r>
+        <w:br w:type="page"/>
+      </w:r>
+    </w:p>
+    <w:p>
+      <w:pPr>
+        <w:pStyle w:val="Titre1"/>
+      </w:pPr>
+      <w:r>
+        <w:lastRenderedPageBreak/>
+        <w:t>2. Archi</w:t>
+      </w:r>
+      <w:r>
+        <w:t>tecture du système RAG</w:t>
+      </w:r>
+    </w:p>
+    <w:p>
+      <w:pPr>
+        <w:pStyle w:val="Titre2"/>
+      </w:pPr>
+      <w:r>
+        <w:t>2.1 Qu'est-ce que le RAG ?</w:t>
+      </w:r>
+    </w:p>
+    <w:p>
+      <w:pPr>
+        <w:spacing w:before="100" w:after="100"/>
+        <w:jc w:val="both"/>
+      </w:pPr>
+      <w:r>
+        <w:t>Le RAG (</w:t>
+      </w:r>
       <w:proofErr w:type="spellStart"/>
       <w:r>
         <w:t>Retrieval</w:t>
       </w:r>
       <w:proofErr w:type="spellEnd"/>
       <w:r>
-        <w:t xml:space="preserve"> (Recherche) : un moteur de recherche vectorielle qui trouve les documents les plus pertinents par rapport à une question</w:t>
+        <w:t xml:space="preserve"> </w:t>
+      </w:r>
+      <w:proofErr w:type="spellStart"/>
+      <w:r>
+        <w:t>Augmented</w:t>
+      </w:r>
+      <w:proofErr w:type="spellEnd"/>
+      <w:r>
+        <w:t xml:space="preserve"> </w:t>
+      </w:r>
+      <w:proofErr w:type="spellStart"/>
+      <w:r>
+        <w:t>Generation</w:t>
+      </w:r>
+      <w:proofErr w:type="spellEnd"/>
+      <w:r>
+        <w:t>) est une architecture qui combine deux composants principaux :</w:t>
       </w:r>
     </w:p>
     <w:p>
@@ -421,548 +431,14 @@
       </w:pPr>
       <w:proofErr w:type="spellStart"/>
       <w:r>
-        <w:t>Generation</w:t>
+        <w:t>Retrieval</w:t>
       </w:r>
       <w:proofErr w:type="spellEnd"/>
       <w:r>
-        <w:t xml:space="preserve"> (Génération) : un modèle de langage qui génère une réponse naturelle en s'appuyant sur les documents trouvés</w:t>
-      </w:r>
-    </w:p>
-    <w:p>
-      <w:pPr>
-        <w:spacing w:before="100" w:after="100"/>
-      </w:pPr>
-    </w:p>
-    <w:p>
-      <w:pPr>
-        <w:pStyle w:val="Titre2"/>
-      </w:pPr>
-      <w:r>
-        <w:t>2.2 Schéma de l'architecture</w:t>
-      </w:r>
-    </w:p>
-    <w:p>
-      <w:pPr>
-        <w:spacing w:before="100" w:after="100"/>
-      </w:pPr>
-    </w:p>
-    <w:tbl>
-      <w:tblPr>
-        <w:tblW w:w="9000" w:type="dxa"/>
-        <w:tblBorders>
-          <w:top w:val="single" w:sz="4" w:space="0" w:color="auto"/>
-          <w:left w:val="single" w:sz="4" w:space="0" w:color="auto"/>
-          <w:bottom w:val="single" w:sz="4" w:space="0" w:color="auto"/>
-          <w:right w:val="single" w:sz="4" w:space="0" w:color="auto"/>
-          <w:insideH w:val="single" w:sz="4" w:space="0" w:color="auto"/>
-          <w:insideV w:val="single" w:sz="4" w:space="0" w:color="auto"/>
-        </w:tblBorders>
-        <w:tblCellMar>
-          <w:left w:w="10" w:type="dxa"/>
-          <w:right w:w="10" w:type="dxa"/>
-        </w:tblCellMar>
-        <w:tblLook w:val="04A0" w:firstRow="1" w:lastRow="0" w:firstColumn="1" w:lastColumn="0" w:noHBand="0" w:noVBand="1"/>
-      </w:tblPr>
-      <w:tblGrid>
-        <w:gridCol w:w="2500"/>
-        <w:gridCol w:w="3000"/>
-        <w:gridCol w:w="3500"/>
-      </w:tblGrid>
-      <w:tr>
-        <w:tblPrEx>
-          <w:tblCellMar>
-            <w:top w:w="0" w:type="dxa"/>
-            <w:bottom w:w="0" w:type="dxa"/>
-          </w:tblCellMar>
-        </w:tblPrEx>
-        <w:tc>
-          <w:tcPr>
-            <w:tcW w:w="2500" w:type="dxa"/>
-            <w:tcBorders>
-              <w:top w:val="single" w:sz="1" w:space="0" w:color="2E75B6"/>
-              <w:left w:val="single" w:sz="1" w:space="0" w:color="2E75B6"/>
-              <w:bottom w:val="single" w:sz="1" w:space="0" w:color="2E75B6"/>
-              <w:right w:val="single" w:sz="1" w:space="0" w:color="2E75B6"/>
-            </w:tcBorders>
-            <w:shd w:val="clear" w:color="auto" w:fill="2E75B6"/>
-            <w:tcMar>
-              <w:top w:w="80" w:type="dxa"/>
-              <w:left w:w="120" w:type="dxa"/>
-              <w:bottom w:w="80" w:type="dxa"/>
-              <w:right w:w="120" w:type="dxa"/>
-            </w:tcMar>
-          </w:tcPr>
-          <w:p>
-            <w:r>
-              <w:rPr>
-                <w:b/>
-                <w:bCs/>
-                <w:color w:val="FFFFFF"/>
-                <w:sz w:val="22"/>
-                <w:szCs w:val="22"/>
-              </w:rPr>
-              <w:t>Étape</w:t>
-            </w:r>
-          </w:p>
-        </w:tc>
-        <w:tc>
-          <w:tcPr>
-            <w:tcW w:w="3000" w:type="dxa"/>
-            <w:tcBorders>
-              <w:top w:val="single" w:sz="1" w:space="0" w:color="2E75B6"/>
-              <w:left w:val="single" w:sz="1" w:space="0" w:color="2E75B6"/>
-              <w:bottom w:val="single" w:sz="1" w:space="0" w:color="2E75B6"/>
-              <w:right w:val="single" w:sz="1" w:space="0" w:color="2E75B6"/>
-            </w:tcBorders>
-            <w:shd w:val="clear" w:color="auto" w:fill="2E75B6"/>
-            <w:tcMar>
-              <w:top w:w="80" w:type="dxa"/>
-              <w:left w:w="120" w:type="dxa"/>
-              <w:bottom w:w="80" w:type="dxa"/>
-              <w:right w:w="120" w:type="dxa"/>
-            </w:tcMar>
-          </w:tcPr>
-          <w:p>
-            <w:r>
-              <w:rPr>
-                <w:b/>
-                <w:bCs/>
-                <w:color w:val="FFFFFF"/>
-                <w:sz w:val="22"/>
-                <w:szCs w:val="22"/>
-              </w:rPr>
-              <w:t>Composant</w:t>
-            </w:r>
-          </w:p>
-        </w:tc>
-        <w:tc>
-          <w:tcPr>
-            <w:tcW w:w="3500" w:type="dxa"/>
-            <w:tcBorders>
-              <w:top w:val="single" w:sz="1" w:space="0" w:color="2E75B6"/>
-              <w:left w:val="single" w:sz="1" w:space="0" w:color="2E75B6"/>
-              <w:bottom w:val="single" w:sz="1" w:space="0" w:color="2E75B6"/>
-              <w:right w:val="single" w:sz="1" w:space="0" w:color="2E75B6"/>
-            </w:tcBorders>
-            <w:shd w:val="clear" w:color="auto" w:fill="2E75B6"/>
-            <w:tcMar>
-              <w:top w:w="80" w:type="dxa"/>
-              <w:left w:w="120" w:type="dxa"/>
-              <w:bottom w:w="80" w:type="dxa"/>
-              <w:right w:w="120" w:type="dxa"/>
-            </w:tcMar>
-          </w:tcPr>
-          <w:p>
-            <w:r>
-              <w:rPr>
-                <w:b/>
-                <w:bCs/>
-                <w:color w:val="FFFFFF"/>
-                <w:sz w:val="22"/>
-                <w:szCs w:val="22"/>
-              </w:rPr>
-              <w:t>Rôle</w:t>
-            </w:r>
-          </w:p>
-        </w:tc>
-      </w:tr>
-      <w:tr>
-        <w:tblPrEx>
-          <w:tblCellMar>
-            <w:top w:w="0" w:type="dxa"/>
-            <w:bottom w:w="0" w:type="dxa"/>
-          </w:tblCellMar>
-        </w:tblPrEx>
-        <w:tc>
-          <w:tcPr>
-            <w:tcW w:w="2500" w:type="dxa"/>
-            <w:tcBorders>
-              <w:top w:val="single" w:sz="1" w:space="0" w:color="CCCCCC"/>
-              <w:left w:val="single" w:sz="1" w:space="0" w:color="CCCCCC"/>
-              <w:bottom w:val="single" w:sz="1" w:space="0" w:color="CCCCCC"/>
-              <w:right w:val="single" w:sz="1" w:space="0" w:color="CCCCCC"/>
-            </w:tcBorders>
-            <w:shd w:val="clear" w:color="auto" w:fill="F5F5F5"/>
-            <w:tcMar>
-              <w:top w:w="80" w:type="dxa"/>
-              <w:left w:w="120" w:type="dxa"/>
-              <w:bottom w:w="80" w:type="dxa"/>
-              <w:right w:w="120" w:type="dxa"/>
-            </w:tcMar>
-          </w:tcPr>
-          <w:p>
-            <w:r>
-              <w:rPr>
-                <w:sz w:val="22"/>
-                <w:szCs w:val="22"/>
-              </w:rPr>
-              <w:t>1 - Indexation</w:t>
-            </w:r>
-          </w:p>
-        </w:tc>
-        <w:tc>
-          <w:tcPr>
-            <w:tcW w:w="3000" w:type="dxa"/>
-            <w:tcBorders>
-              <w:top w:val="single" w:sz="1" w:space="0" w:color="CCCCCC"/>
-              <w:left w:val="single" w:sz="1" w:space="0" w:color="CCCCCC"/>
-              <w:bottom w:val="single" w:sz="1" w:space="0" w:color="CCCCCC"/>
-              <w:right w:val="single" w:sz="1" w:space="0" w:color="CCCCCC"/>
-            </w:tcBorders>
-            <w:shd w:val="clear" w:color="auto" w:fill="F5F5F5"/>
-            <w:tcMar>
-              <w:top w:w="80" w:type="dxa"/>
-              <w:left w:w="120" w:type="dxa"/>
-              <w:bottom w:w="80" w:type="dxa"/>
-              <w:right w:w="120" w:type="dxa"/>
-            </w:tcMar>
-          </w:tcPr>
-          <w:p>
-            <w:proofErr w:type="spellStart"/>
-            <w:r>
-              <w:rPr>
-                <w:sz w:val="22"/>
-                <w:szCs w:val="22"/>
-              </w:rPr>
-              <w:t>SentenceTransformer</w:t>
-            </w:r>
-            <w:proofErr w:type="spellEnd"/>
-            <w:r>
-              <w:rPr>
-                <w:sz w:val="22"/>
-                <w:szCs w:val="22"/>
-              </w:rPr>
-              <w:t xml:space="preserve"> + FAISS</w:t>
-            </w:r>
-          </w:p>
-        </w:tc>
-        <w:tc>
-          <w:tcPr>
-            <w:tcW w:w="3500" w:type="dxa"/>
-            <w:tcBorders>
-              <w:top w:val="single" w:sz="1" w:space="0" w:color="CCCCCC"/>
-              <w:left w:val="single" w:sz="1" w:space="0" w:color="CCCCCC"/>
-              <w:bottom w:val="single" w:sz="1" w:space="0" w:color="CCCCCC"/>
-              <w:right w:val="single" w:sz="1" w:space="0" w:color="CCCCCC"/>
-            </w:tcBorders>
-            <w:shd w:val="clear" w:color="auto" w:fill="F5F5F5"/>
-            <w:tcMar>
-              <w:top w:w="80" w:type="dxa"/>
-              <w:left w:w="120" w:type="dxa"/>
-              <w:bottom w:w="80" w:type="dxa"/>
-              <w:right w:w="120" w:type="dxa"/>
-            </w:tcMar>
-          </w:tcPr>
-          <w:p>
-            <w:r>
-              <w:rPr>
-                <w:sz w:val="22"/>
-                <w:szCs w:val="22"/>
-              </w:rPr>
-              <w:t>Transformation des textes en vecteurs et stockage dans l'index</w:t>
-            </w:r>
-          </w:p>
-        </w:tc>
-      </w:tr>
-      <w:tr>
-        <w:tblPrEx>
-          <w:tblCellMar>
-            <w:top w:w="0" w:type="dxa"/>
-            <w:bottom w:w="0" w:type="dxa"/>
-          </w:tblCellMar>
-        </w:tblPrEx>
-        <w:tc>
-          <w:tcPr>
-            <w:tcW w:w="2500" w:type="dxa"/>
-            <w:tcBorders>
-              <w:top w:val="single" w:sz="1" w:space="0" w:color="CCCCCC"/>
-              <w:left w:val="single" w:sz="1" w:space="0" w:color="CCCCCC"/>
-              <w:bottom w:val="single" w:sz="1" w:space="0" w:color="CCCCCC"/>
-              <w:right w:val="single" w:sz="1" w:space="0" w:color="CCCCCC"/>
-            </w:tcBorders>
-            <w:shd w:val="clear" w:color="auto" w:fill="FFFFFF"/>
-            <w:tcMar>
-              <w:top w:w="80" w:type="dxa"/>
-              <w:left w:w="120" w:type="dxa"/>
-              <w:bottom w:w="80" w:type="dxa"/>
-              <w:right w:w="120" w:type="dxa"/>
-            </w:tcMar>
-          </w:tcPr>
-          <w:p>
-            <w:r>
-              <w:rPr>
-                <w:sz w:val="22"/>
-                <w:szCs w:val="22"/>
-              </w:rPr>
-              <w:t>2 - Requête</w:t>
-            </w:r>
-          </w:p>
-        </w:tc>
-        <w:tc>
-          <w:tcPr>
-            <w:tcW w:w="3000" w:type="dxa"/>
-            <w:tcBorders>
-              <w:top w:val="single" w:sz="1" w:space="0" w:color="CCCCCC"/>
-              <w:left w:val="single" w:sz="1" w:space="0" w:color="CCCCCC"/>
-              <w:bottom w:val="single" w:sz="1" w:space="0" w:color="CCCCCC"/>
-              <w:right w:val="single" w:sz="1" w:space="0" w:color="CCCCCC"/>
-            </w:tcBorders>
-            <w:shd w:val="clear" w:color="auto" w:fill="FFFFFF"/>
-            <w:tcMar>
-              <w:top w:w="80" w:type="dxa"/>
-              <w:left w:w="120" w:type="dxa"/>
-              <w:bottom w:w="80" w:type="dxa"/>
-              <w:right w:w="120" w:type="dxa"/>
-            </w:tcMar>
-          </w:tcPr>
-          <w:p>
-            <w:proofErr w:type="spellStart"/>
-            <w:r>
-              <w:rPr>
-                <w:sz w:val="22"/>
-                <w:szCs w:val="22"/>
-              </w:rPr>
-              <w:t>SentenceTransformer</w:t>
-            </w:r>
-            <w:proofErr w:type="spellEnd"/>
-          </w:p>
-        </w:tc>
-        <w:tc>
-          <w:tcPr>
-            <w:tcW w:w="3500" w:type="dxa"/>
-            <w:tcBorders>
-              <w:top w:val="single" w:sz="1" w:space="0" w:color="CCCCCC"/>
-              <w:left w:val="single" w:sz="1" w:space="0" w:color="CCCCCC"/>
-              <w:bottom w:val="single" w:sz="1" w:space="0" w:color="CCCCCC"/>
-              <w:right w:val="single" w:sz="1" w:space="0" w:color="CCCCCC"/>
-            </w:tcBorders>
-            <w:shd w:val="clear" w:color="auto" w:fill="FFFFFF"/>
-            <w:tcMar>
-              <w:top w:w="80" w:type="dxa"/>
-              <w:left w:w="120" w:type="dxa"/>
-              <w:bottom w:w="80" w:type="dxa"/>
-              <w:right w:w="120" w:type="dxa"/>
-            </w:tcMar>
-          </w:tcPr>
-          <w:p>
-            <w:r>
-              <w:rPr>
-                <w:sz w:val="22"/>
-                <w:szCs w:val="22"/>
-              </w:rPr>
-              <w:t>Transformation de la question en vecteur</w:t>
-            </w:r>
-          </w:p>
-        </w:tc>
-      </w:tr>
-      <w:tr>
-        <w:tblPrEx>
-          <w:tblCellMar>
-            <w:top w:w="0" w:type="dxa"/>
-            <w:bottom w:w="0" w:type="dxa"/>
-          </w:tblCellMar>
-        </w:tblPrEx>
-        <w:tc>
-          <w:tcPr>
-            <w:tcW w:w="2500" w:type="dxa"/>
-            <w:tcBorders>
-              <w:top w:val="single" w:sz="1" w:space="0" w:color="CCCCCC"/>
-              <w:left w:val="single" w:sz="1" w:space="0" w:color="CCCCCC"/>
-              <w:bottom w:val="single" w:sz="1" w:space="0" w:color="CCCCCC"/>
-              <w:right w:val="single" w:sz="1" w:space="0" w:color="CCCCCC"/>
-            </w:tcBorders>
-            <w:shd w:val="clear" w:color="auto" w:fill="F5F5F5"/>
-            <w:tcMar>
-              <w:top w:w="80" w:type="dxa"/>
-              <w:left w:w="120" w:type="dxa"/>
-              <w:bottom w:w="80" w:type="dxa"/>
-              <w:right w:w="120" w:type="dxa"/>
-            </w:tcMar>
-          </w:tcPr>
-          <w:p>
-            <w:r>
-              <w:rPr>
-                <w:sz w:val="22"/>
-                <w:szCs w:val="22"/>
-              </w:rPr>
-              <w:t>3 - Recherche</w:t>
-            </w:r>
-          </w:p>
-        </w:tc>
-        <w:tc>
-          <w:tcPr>
-            <w:tcW w:w="3000" w:type="dxa"/>
-            <w:tcBorders>
-              <w:top w:val="single" w:sz="1" w:space="0" w:color="CCCCCC"/>
-              <w:left w:val="single" w:sz="1" w:space="0" w:color="CCCCCC"/>
-              <w:bottom w:val="single" w:sz="1" w:space="0" w:color="CCCCCC"/>
-              <w:right w:val="single" w:sz="1" w:space="0" w:color="CCCCCC"/>
-            </w:tcBorders>
-            <w:shd w:val="clear" w:color="auto" w:fill="F5F5F5"/>
-            <w:tcMar>
-              <w:top w:w="80" w:type="dxa"/>
-              <w:left w:w="120" w:type="dxa"/>
-              <w:bottom w:w="80" w:type="dxa"/>
-              <w:right w:w="120" w:type="dxa"/>
-            </w:tcMar>
-          </w:tcPr>
-          <w:p>
-            <w:r>
-              <w:rPr>
-                <w:sz w:val="22"/>
-                <w:szCs w:val="22"/>
-              </w:rPr>
-              <w:t>FAISS</w:t>
-            </w:r>
-          </w:p>
-        </w:tc>
-        <w:tc>
-          <w:tcPr>
-            <w:tcW w:w="3500" w:type="dxa"/>
-            <w:tcBorders>
-              <w:top w:val="single" w:sz="1" w:space="0" w:color="CCCCCC"/>
-              <w:left w:val="single" w:sz="1" w:space="0" w:color="CCCCCC"/>
-              <w:bottom w:val="single" w:sz="1" w:space="0" w:color="CCCCCC"/>
-              <w:right w:val="single" w:sz="1" w:space="0" w:color="CCCCCC"/>
-            </w:tcBorders>
-            <w:shd w:val="clear" w:color="auto" w:fill="F5F5F5"/>
-            <w:tcMar>
-              <w:top w:w="80" w:type="dxa"/>
-              <w:left w:w="120" w:type="dxa"/>
-              <w:bottom w:w="80" w:type="dxa"/>
-              <w:right w:w="120" w:type="dxa"/>
-            </w:tcMar>
-          </w:tcPr>
-          <w:p>
-            <w:r>
-              <w:rPr>
-                <w:sz w:val="22"/>
-                <w:szCs w:val="22"/>
-              </w:rPr>
-              <w:t>Recherche des événements les plus proches (Top 25 → filtre date → Top 5)</w:t>
-            </w:r>
-          </w:p>
-        </w:tc>
-      </w:tr>
-      <w:tr>
-        <w:tblPrEx>
-          <w:tblCellMar>
-            <w:top w:w="0" w:type="dxa"/>
-            <w:bottom w:w="0" w:type="dxa"/>
-          </w:tblCellMar>
-        </w:tblPrEx>
-        <w:tc>
-          <w:tcPr>
-            <w:tcW w:w="2500" w:type="dxa"/>
-            <w:tcBorders>
-              <w:top w:val="single" w:sz="1" w:space="0" w:color="CCCCCC"/>
-              <w:left w:val="single" w:sz="1" w:space="0" w:color="CCCCCC"/>
-              <w:bottom w:val="single" w:sz="1" w:space="0" w:color="CCCCCC"/>
-              <w:right w:val="single" w:sz="1" w:space="0" w:color="CCCCCC"/>
-            </w:tcBorders>
-            <w:shd w:val="clear" w:color="auto" w:fill="FFFFFF"/>
-            <w:tcMar>
-              <w:top w:w="80" w:type="dxa"/>
-              <w:left w:w="120" w:type="dxa"/>
-              <w:bottom w:w="80" w:type="dxa"/>
-              <w:right w:w="120" w:type="dxa"/>
-            </w:tcMar>
-          </w:tcPr>
-          <w:p>
-            <w:r>
-              <w:rPr>
-                <w:sz w:val="22"/>
-                <w:szCs w:val="22"/>
-              </w:rPr>
-              <w:t>4 - Génération</w:t>
-            </w:r>
-          </w:p>
-        </w:tc>
-        <w:tc>
-          <w:tcPr>
-            <w:tcW w:w="3000" w:type="dxa"/>
-            <w:tcBorders>
-              <w:top w:val="single" w:sz="1" w:space="0" w:color="CCCCCC"/>
-              <w:left w:val="single" w:sz="1" w:space="0" w:color="CCCCCC"/>
-              <w:bottom w:val="single" w:sz="1" w:space="0" w:color="CCCCCC"/>
-              <w:right w:val="single" w:sz="1" w:space="0" w:color="CCCCCC"/>
-            </w:tcBorders>
-            <w:shd w:val="clear" w:color="auto" w:fill="FFFFFF"/>
-            <w:tcMar>
-              <w:top w:w="80" w:type="dxa"/>
-              <w:left w:w="120" w:type="dxa"/>
-              <w:bottom w:w="80" w:type="dxa"/>
-              <w:right w:w="120" w:type="dxa"/>
-            </w:tcMar>
-          </w:tcPr>
-          <w:p>
-            <w:r>
-              <w:rPr>
-                <w:sz w:val="22"/>
-                <w:szCs w:val="22"/>
-              </w:rPr>
-              <w:t xml:space="preserve">Mistral AI via </w:t>
-            </w:r>
-            <w:proofErr w:type="spellStart"/>
-            <w:r>
-              <w:rPr>
-                <w:sz w:val="22"/>
-                <w:szCs w:val="22"/>
-              </w:rPr>
-              <w:t>LangChain</w:t>
-            </w:r>
-            <w:proofErr w:type="spellEnd"/>
-          </w:p>
-        </w:tc>
-        <w:tc>
-          <w:tcPr>
-            <w:tcW w:w="3500" w:type="dxa"/>
-            <w:tcBorders>
-              <w:top w:val="single" w:sz="1" w:space="0" w:color="CCCCCC"/>
-              <w:left w:val="single" w:sz="1" w:space="0" w:color="CCCCCC"/>
-              <w:bottom w:val="single" w:sz="1" w:space="0" w:color="CCCCCC"/>
-              <w:right w:val="single" w:sz="1" w:space="0" w:color="CCCCCC"/>
-            </w:tcBorders>
-            <w:shd w:val="clear" w:color="auto" w:fill="FFFFFF"/>
-            <w:tcMar>
-              <w:top w:w="80" w:type="dxa"/>
-              <w:left w:w="120" w:type="dxa"/>
-              <w:bottom w:w="80" w:type="dxa"/>
-              <w:right w:w="120" w:type="dxa"/>
-            </w:tcMar>
-          </w:tcPr>
-          <w:p>
-            <w:r>
-              <w:rPr>
-                <w:sz w:val="22"/>
-                <w:szCs w:val="22"/>
-              </w:rPr>
-              <w:t>Génération d'une réponse naturelle en français</w:t>
-            </w:r>
-          </w:p>
-        </w:tc>
-      </w:tr>
-    </w:tbl>
-    <w:p>
-      <w:pPr>
-        <w:spacing w:before="100" w:after="100"/>
-      </w:pPr>
-    </w:p>
-    <w:p>
-      <w:pPr>
-        <w:pStyle w:val="Titre2"/>
-      </w:pPr>
-      <w:r>
-        <w:t>2.3 Pipeline de données</w:t>
-      </w:r>
-    </w:p>
-    <w:p>
-      <w:pPr>
-        <w:spacing w:before="100" w:after="100"/>
-        <w:jc w:val="both"/>
-      </w:pPr>
-      <w:r>
-        <w:t>Le pipeline de traitement des données se déroule en trois étapes successives, orchestrées par le script pipeline.py :</w:t>
+        <w:t xml:space="preserve"> (Recherche) : un moteur de recherche vectorielle qui trouve les documents les plus pertinents </w:t>
+      </w:r>
+      <w:r>
+        <w:t>par rapport à une question</w:t>
       </w:r>
     </w:p>
     <w:p>
@@ -974,40 +450,13 @@
         </w:numPr>
         <w:spacing w:before="60" w:after="60"/>
       </w:pPr>
-      <w:r>
-        <w:t>Étape 1 — 01_fetch_data.py : lecture du fichier JSON Open Agenda, nettoyage des caractères spéciaux, filtrage par département (Gironde) et</w:t>
-      </w:r>
-      <w:r>
-        <w:t xml:space="preserve"> par date (moins d'un an)</w:t>
-      </w:r>
-    </w:p>
-    <w:p>
-      <w:pPr>
-        <w:pStyle w:val="Paragraphedeliste"/>
-        <w:numPr>
-          <w:ilvl w:val="0"/>
-          <w:numId w:val="2"/>
-        </w:numPr>
-        <w:spacing w:before="60" w:after="60"/>
-      </w:pPr>
-      <w:r>
-        <w:t>Étape 2 — 02_preprocess_data.py : nettoyage avancé des données (suppression des balises HTML, des doublons, des valeurs manquantes, normalisation des espaces) et construction du texte complet pour chaque événement</w:t>
-      </w:r>
-    </w:p>
-    <w:p>
-      <w:pPr>
-        <w:pStyle w:val="Paragraphedeliste"/>
-        <w:numPr>
-          <w:ilvl w:val="0"/>
-          <w:numId w:val="2"/>
-        </w:numPr>
-        <w:spacing w:before="60" w:after="60"/>
-      </w:pPr>
-      <w:r>
-        <w:t>Étape 3 — 03_bui</w:t>
-      </w:r>
-      <w:r>
-        <w:t>ld_vectorstore.py : vectorisation des textes avec le modèle all-MiniLM-L6-v2 et création de l'index FAISS</w:t>
+      <w:proofErr w:type="spellStart"/>
+      <w:r>
+        <w:t>Generation</w:t>
+      </w:r>
+      <w:proofErr w:type="spellEnd"/>
+      <w:r>
+        <w:t xml:space="preserve"> (Génération) : un modèle de langage qui génère une réponse naturelle en s'appuyant sur les documents trouvés</w:t>
       </w:r>
     </w:p>
     <w:p>
@@ -1016,64 +465,11 @@
       </w:pPr>
     </w:p>
     <w:p>
-      <w:r>
-        <w:br w:type="page"/>
-      </w:r>
-    </w:p>
-    <w:p>
-      <w:pPr>
-        <w:pStyle w:val="Titre1"/>
-      </w:pPr>
-      <w:r>
-        <w:lastRenderedPageBreak/>
-        <w:t>3. Données</w:t>
-      </w:r>
-    </w:p>
-    <w:p>
       <w:pPr>
         <w:pStyle w:val="Titre2"/>
       </w:pPr>
       <w:r>
-        <w:t>3.1 Source des données</w:t>
-      </w:r>
-    </w:p>
-    <w:p>
-      <w:pPr>
-        <w:spacing w:before="100" w:after="100"/>
-        <w:jc w:val="both"/>
-      </w:pPr>
-      <w:r>
-        <w:t>Les données proviennent de la plateforme Open Agenda, accessible via l'URL : https://public.opendatasoft.com/expl</w:t>
-      </w:r>
-      <w:r>
-        <w:t>ore/assets/evenements-publics-openagenda/export/</w:t>
-      </w:r>
-    </w:p>
-    <w:p>
-      <w:pPr>
-        <w:spacing w:before="100" w:after="100"/>
-      </w:pPr>
-    </w:p>
-    <w:p>
-      <w:pPr>
-        <w:spacing w:before="100" w:after="100"/>
-        <w:jc w:val="both"/>
-      </w:pPr>
-      <w:r>
-        <w:t>Le fichier JSON téléchargé contient 1 152 529 événements culturels de toute la France, pour un poids total de 4,6 Go.</w:t>
-      </w:r>
-    </w:p>
-    <w:p>
-      <w:pPr>
-        <w:spacing w:before="100" w:after="100"/>
-      </w:pPr>
-    </w:p>
-    <w:p>
-      <w:pPr>
-        <w:pStyle w:val="Titre2"/>
-      </w:pPr>
-      <w:r>
-        <w:t>3.2 Filtrage des données</w:t>
+        <w:t>2.2 Schéma de l'architecture</w:t>
       </w:r>
     </w:p>
     <w:p>
@@ -1099,9 +495,9 @@
         <w:tblLook w:val="04A0" w:firstRow="1" w:lastRow="0" w:firstColumn="1" w:lastColumn="0" w:noHBand="0" w:noVBand="1"/>
       </w:tblPr>
       <w:tblGrid>
-        <w:gridCol w:w="2500"/>
+        <w:gridCol w:w="2200"/>
         <w:gridCol w:w="3500"/>
-        <w:gridCol w:w="2900"/>
+        <w:gridCol w:w="3200"/>
       </w:tblGrid>
       <w:tr>
         <w:tblPrEx>
@@ -1112,7 +508,7 @@
         </w:tblPrEx>
         <w:tc>
           <w:tcPr>
-            <w:tcW w:w="2500" w:type="dxa"/>
+            <w:tcW w:w="2200" w:type="dxa"/>
             <w:tcBorders>
               <w:top w:val="single" w:sz="1" w:space="0" w:color="2E75B6"/>
               <w:left w:val="single" w:sz="1" w:space="0" w:color="2E75B6"/>
@@ -1136,7 +532,7 @@
                 <w:sz w:val="22"/>
                 <w:szCs w:val="22"/>
               </w:rPr>
-              <w:t>Filtre</w:t>
+              <w:t>Étape</w:t>
             </w:r>
           </w:p>
         </w:tc>
@@ -1166,13 +562,13 @@
                 <w:sz w:val="22"/>
                 <w:szCs w:val="22"/>
               </w:rPr>
-              <w:t>Critère</w:t>
-            </w:r>
-          </w:p>
-        </w:tc>
-        <w:tc>
-          <w:tcPr>
-            <w:tcW w:w="2900" w:type="dxa"/>
+              <w:t>Composant</w:t>
+            </w:r>
+          </w:p>
+        </w:tc>
+        <w:tc>
+          <w:tcPr>
+            <w:tcW w:w="3200" w:type="dxa"/>
             <w:tcBorders>
               <w:top w:val="single" w:sz="1" w:space="0" w:color="2E75B6"/>
               <w:left w:val="single" w:sz="1" w:space="0" w:color="2E75B6"/>
@@ -1196,7 +592,7 @@
                 <w:sz w:val="22"/>
                 <w:szCs w:val="22"/>
               </w:rPr>
-              <w:t>Résultat</w:t>
+              <w:t>Rôle</w:t>
             </w:r>
           </w:p>
         </w:tc>
@@ -1210,7 +606,7 @@
         </w:tblPrEx>
         <w:tc>
           <w:tcPr>
-            <w:tcW w:w="2500" w:type="dxa"/>
+            <w:tcW w:w="2200" w:type="dxa"/>
             <w:tcBorders>
               <w:top w:val="single" w:sz="1" w:space="0" w:color="CCCCCC"/>
               <w:left w:val="single" w:sz="1" w:space="0" w:color="CCCCCC"/>
@@ -1231,7 +627,7 @@
                 <w:sz w:val="22"/>
                 <w:szCs w:val="22"/>
               </w:rPr>
-              <w:t>Géographique</w:t>
+              <w:t>1 - Indexation</w:t>
             </w:r>
           </w:p>
         </w:tc>
@@ -1253,22 +649,20 @@
             </w:tcMar>
           </w:tcPr>
           <w:p>
+            <w:r>
+              <w:rPr>
+                <w:sz w:val="22"/>
+                <w:szCs w:val="22"/>
+              </w:rPr>
+              <w:t xml:space="preserve">API Open Agenda + </w:t>
+            </w:r>
             <w:proofErr w:type="spellStart"/>
-            <w:proofErr w:type="gramStart"/>
-            <w:r>
-              <w:rPr>
-                <w:sz w:val="22"/>
-                <w:szCs w:val="22"/>
-              </w:rPr>
-              <w:t>location</w:t>
-            </w:r>
-            <w:proofErr w:type="gramEnd"/>
-            <w:r>
-              <w:rPr>
-                <w:sz w:val="22"/>
-                <w:szCs w:val="22"/>
-              </w:rPr>
-              <w:t>_department</w:t>
+            <w:r>
+              <w:rPr>
+                <w:sz w:val="22"/>
+                <w:szCs w:val="22"/>
+              </w:rPr>
+              <w:t>SentenceTransformer</w:t>
             </w:r>
             <w:proofErr w:type="spellEnd"/>
             <w:r>
@@ -1276,13 +670,13 @@
                 <w:sz w:val="22"/>
                 <w:szCs w:val="22"/>
               </w:rPr>
-              <w:t xml:space="preserve"> = 'Gironde'</w:t>
-            </w:r>
-          </w:p>
-        </w:tc>
-        <w:tc>
-          <w:tcPr>
-            <w:tcW w:w="2900" w:type="dxa"/>
+              <w:t xml:space="preserve"> + FAISS</w:t>
+            </w:r>
+          </w:p>
+        </w:tc>
+        <w:tc>
+          <w:tcPr>
+            <w:tcW w:w="3200" w:type="dxa"/>
             <w:tcBorders>
               <w:top w:val="single" w:sz="1" w:space="0" w:color="CCCCCC"/>
               <w:left w:val="single" w:sz="1" w:space="0" w:color="CCCCCC"/>
@@ -1303,7 +697,7 @@
                 <w:sz w:val="22"/>
                 <w:szCs w:val="22"/>
               </w:rPr>
-              <w:t>50 566 événements retenus</w:t>
+              <w:t>Récupération, nettoyage, vectorisation et stockage des événements</w:t>
             </w:r>
           </w:p>
         </w:tc>
@@ -1317,7 +711,7 @@
         </w:tblPrEx>
         <w:tc>
           <w:tcPr>
-            <w:tcW w:w="2500" w:type="dxa"/>
+            <w:tcW w:w="2200" w:type="dxa"/>
             <w:tcBorders>
               <w:top w:val="single" w:sz="1" w:space="0" w:color="CCCCCC"/>
               <w:left w:val="single" w:sz="1" w:space="0" w:color="CCCCCC"/>
@@ -1338,7 +732,7 @@
                 <w:sz w:val="22"/>
                 <w:szCs w:val="22"/>
               </w:rPr>
-              <w:t>Temporel</w:t>
+              <w:t>2 - Requête</w:t>
             </w:r>
           </w:p>
         </w:tc>
@@ -1361,35 +755,19 @@
           </w:tcPr>
           <w:p>
             <w:proofErr w:type="spellStart"/>
-            <w:proofErr w:type="gramStart"/>
-            <w:r>
-              <w:rPr>
-                <w:sz w:val="22"/>
-                <w:szCs w:val="22"/>
-              </w:rPr>
-              <w:t>lastdate</w:t>
-            </w:r>
-            <w:proofErr w:type="gramEnd"/>
-            <w:r>
-              <w:rPr>
-                <w:sz w:val="22"/>
-                <w:szCs w:val="22"/>
-              </w:rPr>
-              <w:t>_end</w:t>
+            <w:r>
+              <w:rPr>
+                <w:sz w:val="22"/>
+                <w:szCs w:val="22"/>
+              </w:rPr>
+              <w:t>SentenceTransformer</w:t>
             </w:r>
             <w:proofErr w:type="spellEnd"/>
-            <w:r>
-              <w:rPr>
-                <w:sz w:val="22"/>
-                <w:szCs w:val="22"/>
-              </w:rPr>
-              <w:t xml:space="preserve"> &gt;= aujourd'hui - 365 jours</w:t>
-            </w:r>
-          </w:p>
-        </w:tc>
-        <w:tc>
-          <w:tcPr>
-            <w:tcW w:w="2900" w:type="dxa"/>
+          </w:p>
+        </w:tc>
+        <w:tc>
+          <w:tcPr>
+            <w:tcW w:w="3200" w:type="dxa"/>
             <w:tcBorders>
               <w:top w:val="single" w:sz="1" w:space="0" w:color="CCCCCC"/>
               <w:left w:val="single" w:sz="1" w:space="0" w:color="CCCCCC"/>
@@ -1410,7 +788,7 @@
                 <w:sz w:val="22"/>
                 <w:szCs w:val="22"/>
               </w:rPr>
-              <w:t>12 267 événements retenus</w:t>
+              <w:t>Transformation de la question utilisateur en vecteur</w:t>
             </w:r>
           </w:p>
         </w:tc>
@@ -1424,7 +802,7 @@
         </w:tblPrEx>
         <w:tc>
           <w:tcPr>
-            <w:tcW w:w="2500" w:type="dxa"/>
+            <w:tcW w:w="2200" w:type="dxa"/>
             <w:tcBorders>
               <w:top w:val="single" w:sz="1" w:space="0" w:color="CCCCCC"/>
               <w:left w:val="single" w:sz="1" w:space="0" w:color="CCCCCC"/>
@@ -1445,7 +823,7 @@
                 <w:sz w:val="22"/>
                 <w:szCs w:val="22"/>
               </w:rPr>
-              <w:t>Nettoyage</w:t>
+              <w:t>3 - Recherche</w:t>
             </w:r>
           </w:p>
         </w:tc>
@@ -1472,13 +850,13 @@
                 <w:sz w:val="22"/>
                 <w:szCs w:val="22"/>
               </w:rPr>
-              <w:t>Suppression doublons, sans titre, nettoyage HTML</w:t>
-            </w:r>
-          </w:p>
-        </w:tc>
-        <w:tc>
-          <w:tcPr>
-            <w:tcW w:w="2900" w:type="dxa"/>
+              <w:t>FAISS</w:t>
+            </w:r>
+          </w:p>
+        </w:tc>
+        <w:tc>
+          <w:tcPr>
+            <w:tcW w:w="3200" w:type="dxa"/>
             <w:tcBorders>
               <w:top w:val="single" w:sz="1" w:space="0" w:color="CCCCCC"/>
               <w:left w:val="single" w:sz="1" w:space="0" w:color="CCCCCC"/>
@@ -1499,7 +877,105 @@
                 <w:sz w:val="22"/>
                 <w:szCs w:val="22"/>
               </w:rPr>
-              <w:t>12 264 événements finaux</w:t>
+              <w:t>Recherche des événements les plus proches (Top 25 → filtre date → Top 5)</w:t>
+            </w:r>
+          </w:p>
+        </w:tc>
+      </w:tr>
+      <w:tr>
+        <w:tblPrEx>
+          <w:tblCellMar>
+            <w:top w:w="0" w:type="dxa"/>
+            <w:bottom w:w="0" w:type="dxa"/>
+          </w:tblCellMar>
+        </w:tblPrEx>
+        <w:tc>
+          <w:tcPr>
+            <w:tcW w:w="2200" w:type="dxa"/>
+            <w:tcBorders>
+              <w:top w:val="single" w:sz="1" w:space="0" w:color="CCCCCC"/>
+              <w:left w:val="single" w:sz="1" w:space="0" w:color="CCCCCC"/>
+              <w:bottom w:val="single" w:sz="1" w:space="0" w:color="CCCCCC"/>
+              <w:right w:val="single" w:sz="1" w:space="0" w:color="CCCCCC"/>
+            </w:tcBorders>
+            <w:shd w:val="clear" w:color="auto" w:fill="FFFFFF"/>
+            <w:tcMar>
+              <w:top w:w="80" w:type="dxa"/>
+              <w:left w:w="120" w:type="dxa"/>
+              <w:bottom w:w="80" w:type="dxa"/>
+              <w:right w:w="120" w:type="dxa"/>
+            </w:tcMar>
+          </w:tcPr>
+          <w:p>
+            <w:r>
+              <w:rPr>
+                <w:sz w:val="22"/>
+                <w:szCs w:val="22"/>
+              </w:rPr>
+              <w:t>4 - Génération</w:t>
+            </w:r>
+          </w:p>
+        </w:tc>
+        <w:tc>
+          <w:tcPr>
+            <w:tcW w:w="3500" w:type="dxa"/>
+            <w:tcBorders>
+              <w:top w:val="single" w:sz="1" w:space="0" w:color="CCCCCC"/>
+              <w:left w:val="single" w:sz="1" w:space="0" w:color="CCCCCC"/>
+              <w:bottom w:val="single" w:sz="1" w:space="0" w:color="CCCCCC"/>
+              <w:right w:val="single" w:sz="1" w:space="0" w:color="CCCCCC"/>
+            </w:tcBorders>
+            <w:shd w:val="clear" w:color="auto" w:fill="FFFFFF"/>
+            <w:tcMar>
+              <w:top w:w="80" w:type="dxa"/>
+              <w:left w:w="120" w:type="dxa"/>
+              <w:bottom w:w="80" w:type="dxa"/>
+              <w:right w:w="120" w:type="dxa"/>
+            </w:tcMar>
+          </w:tcPr>
+          <w:p>
+            <w:r>
+              <w:rPr>
+                <w:sz w:val="22"/>
+                <w:szCs w:val="22"/>
+              </w:rPr>
+              <w:t xml:space="preserve">Mistral AI via </w:t>
+            </w:r>
+            <w:proofErr w:type="spellStart"/>
+            <w:r>
+              <w:rPr>
+                <w:sz w:val="22"/>
+                <w:szCs w:val="22"/>
+              </w:rPr>
+              <w:t>LangChain</w:t>
+            </w:r>
+            <w:proofErr w:type="spellEnd"/>
+          </w:p>
+        </w:tc>
+        <w:tc>
+          <w:tcPr>
+            <w:tcW w:w="3200" w:type="dxa"/>
+            <w:tcBorders>
+              <w:top w:val="single" w:sz="1" w:space="0" w:color="CCCCCC"/>
+              <w:left w:val="single" w:sz="1" w:space="0" w:color="CCCCCC"/>
+              <w:bottom w:val="single" w:sz="1" w:space="0" w:color="CCCCCC"/>
+              <w:right w:val="single" w:sz="1" w:space="0" w:color="CCCCCC"/>
+            </w:tcBorders>
+            <w:shd w:val="clear" w:color="auto" w:fill="FFFFFF"/>
+            <w:tcMar>
+              <w:top w:w="80" w:type="dxa"/>
+              <w:left w:w="120" w:type="dxa"/>
+              <w:bottom w:w="80" w:type="dxa"/>
+              <w:right w:w="120" w:type="dxa"/>
+            </w:tcMar>
+          </w:tcPr>
+          <w:p>
+            <w:r>
+              <w:rPr>
+                <w:sz w:val="22"/>
+                <w:szCs w:val="22"/>
+              </w:rPr>
+              <w:t>Génération d'une réponse naturelle en français</w:t>
             </w:r>
           </w:p>
         </w:tc>
@@ -1515,7 +991,7 @@
         <w:pStyle w:val="Titre2"/>
       </w:pPr>
       <w:r>
-        <w:t>3.3 Processus de nettoyage des données</w:t>
+        <w:t>2.3 Pipeline de données</w:t>
       </w:r>
     </w:p>
     <w:p>
@@ -1524,13 +1000,8 @@
         <w:jc w:val="both"/>
       </w:pPr>
       <w:r>
-        <w:t>Un processus de nettoyage en plusieurs étapes a été mis en place pour garantir la qualité des données :</w:t>
-      </w:r>
-    </w:p>
-    <w:p>
-      <w:pPr>
-        <w:spacing w:before="100" w:after="100"/>
-      </w:pPr>
+        <w:t>Le pipeline de traitement des données se déroule en trois étapes successives, orchestrées par le script pipeline.py :</w:t>
+      </w:r>
     </w:p>
     <w:p>
       <w:pPr>
@@ -1542,23 +1013,10 @@
         <w:spacing w:before="60" w:after="60"/>
       </w:pPr>
       <w:r>
-        <w:t>Suppression des balises HTML : les descriptions contiennent des balises &lt;p&gt;, &lt;</w:t>
-      </w:r>
-      <w:proofErr w:type="spellStart"/>
-      <w:r>
-        <w:t>ul</w:t>
-      </w:r>
-      <w:proofErr w:type="spellEnd"/>
-      <w:r>
-        <w:t>&gt;, &lt;li&gt;, &lt;</w:t>
-      </w:r>
-      <w:proofErr w:type="spellStart"/>
-      <w:r>
-        <w:t>em</w:t>
-      </w:r>
-      <w:proofErr w:type="spellEnd"/>
-      <w:r>
-        <w:t>&gt;, etc. qui sont supprimées avec une expression régulière</w:t>
+        <w:t>Étape 1 — 01_fetch_data.py : appel de l'API Open Agenda avec filtres (Gironde, moins d'un an), nettoyage des caractères spéciaux dès la ré</w:t>
+      </w:r>
+      <w:r>
+        <w:t>cupération</w:t>
       </w:r>
     </w:p>
     <w:p>
@@ -1571,31 +1029,7 @@
         <w:spacing w:before="60" w:after="60"/>
       </w:pPr>
       <w:r>
-        <w:t>S</w:t>
-      </w:r>
-      <w:r>
-        <w:t>uppression des entités HTML : les entités comme &amp;</w:t>
-      </w:r>
-      <w:proofErr w:type="spellStart"/>
-      <w:proofErr w:type="gramStart"/>
-      <w:r>
-        <w:t>amp</w:t>
-      </w:r>
-      <w:proofErr w:type="spellEnd"/>
-      <w:r>
-        <w:t>;,</w:t>
-      </w:r>
-      <w:proofErr w:type="gramEnd"/>
-      <w:r>
-        <w:t xml:space="preserve"> &amp;</w:t>
-      </w:r>
-      <w:proofErr w:type="spellStart"/>
-      <w:r>
-        <w:t>nbsp</w:t>
-      </w:r>
-      <w:proofErr w:type="spellEnd"/>
-      <w:r>
-        <w:t>;, &amp;#9; sont également supprimées</w:t>
+        <w:t>Étape 2 — 02_preprocess_data.py : nettoyage avancé des données et construction du texte complet pour chaque événement</w:t>
       </w:r>
     </w:p>
     <w:p>
@@ -1608,16 +1042,579 @@
         <w:spacing w:before="60" w:after="60"/>
       </w:pPr>
       <w:r>
-        <w:t>Correction des caractères mal encodés : les textes encodés en latin1 puis mal interprétés en UTF-8 (</w:t>
-      </w:r>
-      <w:proofErr w:type="gramStart"/>
-      <w:r>
-        <w:t>ex:</w:t>
-      </w:r>
-      <w:proofErr w:type="gramEnd"/>
-      <w:r>
-        <w:t xml:space="preserve"> Ã©, Â, â€˜) sont corrigés</w:t>
-      </w:r>
+        <w:t>Étape 3 — 03_build_vectorstore.py : vectorisation des textes avec all-MiniLM-L6-v2 et création de l'index FAISS</w:t>
+      </w:r>
+    </w:p>
+    <w:p>
+      <w:pPr>
+        <w:spacing w:before="100" w:after="100"/>
+      </w:pPr>
+    </w:p>
+    <w:p>
+      <w:r>
+        <w:br w:type="page"/>
+      </w:r>
+    </w:p>
+    <w:p>
+      <w:pPr>
+        <w:pStyle w:val="Titre1"/>
+      </w:pPr>
+      <w:r>
+        <w:lastRenderedPageBreak/>
+        <w:t>3. Données</w:t>
+      </w:r>
+    </w:p>
+    <w:p>
+      <w:pPr>
+        <w:pStyle w:val="Titre2"/>
+      </w:pPr>
+      <w:r>
+        <w:t>3</w:t>
+      </w:r>
+      <w:r>
+        <w:t>.1 Source des données — API Open Agenda</w:t>
+      </w:r>
+    </w:p>
+    <w:p>
+      <w:pPr>
+        <w:spacing w:before="100" w:after="100"/>
+        <w:jc w:val="both"/>
+      </w:pPr>
+      <w:r>
+        <w:t xml:space="preserve">Les données proviennent de la plateforme Open Agenda, accessible via l'API REST </w:t>
+      </w:r>
+      <w:proofErr w:type="spellStart"/>
+      <w:r>
+        <w:t>OpenDataSoft</w:t>
+      </w:r>
+      <w:proofErr w:type="spellEnd"/>
+      <w:r>
+        <w:t xml:space="preserve"> :</w:t>
+      </w:r>
+    </w:p>
+    <w:p>
+      <w:pPr>
+        <w:spacing w:before="100" w:after="100"/>
+      </w:pPr>
+    </w:p>
+    <w:p>
+      <w:pPr>
+        <w:spacing w:before="100" w:after="100"/>
+      </w:pPr>
+      <w:r>
+        <w:rPr>
+          <w:rFonts w:ascii="Courier New" w:eastAsia="Courier New" w:hAnsi="Courier New" w:cs="Courier New"/>
+          <w:i/>
+          <w:iCs/>
+          <w:color w:val="444444"/>
+          <w:sz w:val="20"/>
+          <w:szCs w:val="20"/>
+        </w:rPr>
+        <w:t>https://public.opendatasoft.com/api/explore/v2.1/catalog/datasets/evenements-publics-openagenda/records</w:t>
+      </w:r>
+    </w:p>
+    <w:p>
+      <w:pPr>
+        <w:spacing w:before="100" w:after="100"/>
+      </w:pPr>
+    </w:p>
+    <w:p>
+      <w:pPr>
+        <w:spacing w:before="100" w:after="100"/>
+        <w:jc w:val="both"/>
+      </w:pPr>
+      <w:r>
+        <w:t>Cette API expose plus de 1 170 000 événements culturels de toute la France. Deux filtres sont appliqués directement dans la requête API pour ne récupér</w:t>
+      </w:r>
+      <w:r>
+        <w:t>er que les données pertinentes :</w:t>
+      </w:r>
+    </w:p>
+    <w:p>
+      <w:pPr>
+        <w:spacing w:before="100" w:after="100"/>
+      </w:pPr>
+    </w:p>
+    <w:tbl>
+      <w:tblPr>
+        <w:tblW w:w="8900" w:type="dxa"/>
+        <w:tblBorders>
+          <w:top w:val="single" w:sz="4" w:space="0" w:color="auto"/>
+          <w:left w:val="single" w:sz="4" w:space="0" w:color="auto"/>
+          <w:bottom w:val="single" w:sz="4" w:space="0" w:color="auto"/>
+          <w:right w:val="single" w:sz="4" w:space="0" w:color="auto"/>
+          <w:insideH w:val="single" w:sz="4" w:space="0" w:color="auto"/>
+          <w:insideV w:val="single" w:sz="4" w:space="0" w:color="auto"/>
+        </w:tblBorders>
+        <w:tblCellMar>
+          <w:left w:w="10" w:type="dxa"/>
+          <w:right w:w="10" w:type="dxa"/>
+        </w:tblCellMar>
+        <w:tblLook w:val="04A0" w:firstRow="1" w:lastRow="0" w:firstColumn="1" w:lastColumn="0" w:noHBand="0" w:noVBand="1"/>
+      </w:tblPr>
+      <w:tblGrid>
+        <w:gridCol w:w="2200"/>
+        <w:gridCol w:w="3500"/>
+        <w:gridCol w:w="3200"/>
+      </w:tblGrid>
+      <w:tr>
+        <w:tblPrEx>
+          <w:tblCellMar>
+            <w:top w:w="0" w:type="dxa"/>
+            <w:bottom w:w="0" w:type="dxa"/>
+          </w:tblCellMar>
+        </w:tblPrEx>
+        <w:tc>
+          <w:tcPr>
+            <w:tcW w:w="2200" w:type="dxa"/>
+            <w:tcBorders>
+              <w:top w:val="single" w:sz="1" w:space="0" w:color="2E75B6"/>
+              <w:left w:val="single" w:sz="1" w:space="0" w:color="2E75B6"/>
+              <w:bottom w:val="single" w:sz="1" w:space="0" w:color="2E75B6"/>
+              <w:right w:val="single" w:sz="1" w:space="0" w:color="2E75B6"/>
+            </w:tcBorders>
+            <w:shd w:val="clear" w:color="auto" w:fill="2E75B6"/>
+            <w:tcMar>
+              <w:top w:w="80" w:type="dxa"/>
+              <w:left w:w="120" w:type="dxa"/>
+              <w:bottom w:w="80" w:type="dxa"/>
+              <w:right w:w="120" w:type="dxa"/>
+            </w:tcMar>
+          </w:tcPr>
+          <w:p>
+            <w:r>
+              <w:rPr>
+                <w:b/>
+                <w:bCs/>
+                <w:color w:val="FFFFFF"/>
+                <w:sz w:val="22"/>
+                <w:szCs w:val="22"/>
+              </w:rPr>
+              <w:t>Paramètre API</w:t>
+            </w:r>
+          </w:p>
+        </w:tc>
+        <w:tc>
+          <w:tcPr>
+            <w:tcW w:w="3500" w:type="dxa"/>
+            <w:tcBorders>
+              <w:top w:val="single" w:sz="1" w:space="0" w:color="2E75B6"/>
+              <w:left w:val="single" w:sz="1" w:space="0" w:color="2E75B6"/>
+              <w:bottom w:val="single" w:sz="1" w:space="0" w:color="2E75B6"/>
+              <w:right w:val="single" w:sz="1" w:space="0" w:color="2E75B6"/>
+            </w:tcBorders>
+            <w:shd w:val="clear" w:color="auto" w:fill="2E75B6"/>
+            <w:tcMar>
+              <w:top w:w="80" w:type="dxa"/>
+              <w:left w:w="120" w:type="dxa"/>
+              <w:bottom w:w="80" w:type="dxa"/>
+              <w:right w:w="120" w:type="dxa"/>
+            </w:tcMar>
+          </w:tcPr>
+          <w:p>
+            <w:r>
+              <w:rPr>
+                <w:b/>
+                <w:bCs/>
+                <w:color w:val="FFFFFF"/>
+                <w:sz w:val="22"/>
+                <w:szCs w:val="22"/>
+              </w:rPr>
+              <w:t>Valeur</w:t>
+            </w:r>
+          </w:p>
+        </w:tc>
+        <w:tc>
+          <w:tcPr>
+            <w:tcW w:w="3200" w:type="dxa"/>
+            <w:tcBorders>
+              <w:top w:val="single" w:sz="1" w:space="0" w:color="2E75B6"/>
+              <w:left w:val="single" w:sz="1" w:space="0" w:color="2E75B6"/>
+              <w:bottom w:val="single" w:sz="1" w:space="0" w:color="2E75B6"/>
+              <w:right w:val="single" w:sz="1" w:space="0" w:color="2E75B6"/>
+            </w:tcBorders>
+            <w:shd w:val="clear" w:color="auto" w:fill="2E75B6"/>
+            <w:tcMar>
+              <w:top w:w="80" w:type="dxa"/>
+              <w:left w:w="120" w:type="dxa"/>
+              <w:bottom w:w="80" w:type="dxa"/>
+              <w:right w:w="120" w:type="dxa"/>
+            </w:tcMar>
+          </w:tcPr>
+          <w:p>
+            <w:r>
+              <w:rPr>
+                <w:b/>
+                <w:bCs/>
+                <w:color w:val="FFFFFF"/>
+                <w:sz w:val="22"/>
+                <w:szCs w:val="22"/>
+              </w:rPr>
+              <w:t>Rôle</w:t>
+            </w:r>
+          </w:p>
+        </w:tc>
+      </w:tr>
+      <w:tr>
+        <w:tblPrEx>
+          <w:tblCellMar>
+            <w:top w:w="0" w:type="dxa"/>
+            <w:bottom w:w="0" w:type="dxa"/>
+          </w:tblCellMar>
+        </w:tblPrEx>
+        <w:tc>
+          <w:tcPr>
+            <w:tcW w:w="2200" w:type="dxa"/>
+            <w:tcBorders>
+              <w:top w:val="single" w:sz="1" w:space="0" w:color="CCCCCC"/>
+              <w:left w:val="single" w:sz="1" w:space="0" w:color="CCCCCC"/>
+              <w:bottom w:val="single" w:sz="1" w:space="0" w:color="CCCCCC"/>
+              <w:right w:val="single" w:sz="1" w:space="0" w:color="CCCCCC"/>
+            </w:tcBorders>
+            <w:shd w:val="clear" w:color="auto" w:fill="F5F5F5"/>
+            <w:tcMar>
+              <w:top w:w="80" w:type="dxa"/>
+              <w:left w:w="120" w:type="dxa"/>
+              <w:bottom w:w="80" w:type="dxa"/>
+              <w:right w:w="120" w:type="dxa"/>
+            </w:tcMar>
+          </w:tcPr>
+          <w:p>
+            <w:proofErr w:type="spellStart"/>
+            <w:proofErr w:type="gramStart"/>
+            <w:r>
+              <w:rPr>
+                <w:sz w:val="22"/>
+                <w:szCs w:val="22"/>
+              </w:rPr>
+              <w:t>refine</w:t>
+            </w:r>
+            <w:proofErr w:type="spellEnd"/>
+            <w:proofErr w:type="gramEnd"/>
+          </w:p>
+        </w:tc>
+        <w:tc>
+          <w:tcPr>
+            <w:tcW w:w="3500" w:type="dxa"/>
+            <w:tcBorders>
+              <w:top w:val="single" w:sz="1" w:space="0" w:color="CCCCCC"/>
+              <w:left w:val="single" w:sz="1" w:space="0" w:color="CCCCCC"/>
+              <w:bottom w:val="single" w:sz="1" w:space="0" w:color="CCCCCC"/>
+              <w:right w:val="single" w:sz="1" w:space="0" w:color="CCCCCC"/>
+            </w:tcBorders>
+            <w:shd w:val="clear" w:color="auto" w:fill="F5F5F5"/>
+            <w:tcMar>
+              <w:top w:w="80" w:type="dxa"/>
+              <w:left w:w="120" w:type="dxa"/>
+              <w:bottom w:w="80" w:type="dxa"/>
+              <w:right w:w="120" w:type="dxa"/>
+            </w:tcMar>
+          </w:tcPr>
+          <w:p>
+            <w:proofErr w:type="spellStart"/>
+            <w:proofErr w:type="gramStart"/>
+            <w:r>
+              <w:rPr>
+                <w:sz w:val="22"/>
+                <w:szCs w:val="22"/>
+              </w:rPr>
+              <w:t>location</w:t>
+            </w:r>
+            <w:proofErr w:type="gramEnd"/>
+            <w:r>
+              <w:rPr>
+                <w:sz w:val="22"/>
+                <w:szCs w:val="22"/>
+              </w:rPr>
+              <w:t>_department:Gironde</w:t>
+            </w:r>
+            <w:proofErr w:type="spellEnd"/>
+          </w:p>
+        </w:tc>
+        <w:tc>
+          <w:tcPr>
+            <w:tcW w:w="3200" w:type="dxa"/>
+            <w:tcBorders>
+              <w:top w:val="single" w:sz="1" w:space="0" w:color="CCCCCC"/>
+              <w:left w:val="single" w:sz="1" w:space="0" w:color="CCCCCC"/>
+              <w:bottom w:val="single" w:sz="1" w:space="0" w:color="CCCCCC"/>
+              <w:right w:val="single" w:sz="1" w:space="0" w:color="CCCCCC"/>
+            </w:tcBorders>
+            <w:shd w:val="clear" w:color="auto" w:fill="F5F5F5"/>
+            <w:tcMar>
+              <w:top w:w="80" w:type="dxa"/>
+              <w:left w:w="120" w:type="dxa"/>
+              <w:bottom w:w="80" w:type="dxa"/>
+              <w:right w:w="120" w:type="dxa"/>
+            </w:tcMar>
+          </w:tcPr>
+          <w:p>
+            <w:r>
+              <w:rPr>
+                <w:sz w:val="22"/>
+                <w:szCs w:val="22"/>
+              </w:rPr>
+              <w:t>Filtre géographique — département Gironde uniquement</w:t>
+            </w:r>
+          </w:p>
+        </w:tc>
+      </w:tr>
+      <w:tr>
+        <w:tblPrEx>
+          <w:tblCellMar>
+            <w:top w:w="0" w:type="dxa"/>
+            <w:bottom w:w="0" w:type="dxa"/>
+          </w:tblCellMar>
+        </w:tblPrEx>
+        <w:tc>
+          <w:tcPr>
+            <w:tcW w:w="2200" w:type="dxa"/>
+            <w:tcBorders>
+              <w:top w:val="single" w:sz="1" w:space="0" w:color="CCCCCC"/>
+              <w:left w:val="single" w:sz="1" w:space="0" w:color="CCCCCC"/>
+              <w:bottom w:val="single" w:sz="1" w:space="0" w:color="CCCCCC"/>
+              <w:right w:val="single" w:sz="1" w:space="0" w:color="CCCCCC"/>
+            </w:tcBorders>
+            <w:shd w:val="clear" w:color="auto" w:fill="FFFFFF"/>
+            <w:tcMar>
+              <w:top w:w="80" w:type="dxa"/>
+              <w:left w:w="120" w:type="dxa"/>
+              <w:bottom w:w="80" w:type="dxa"/>
+              <w:right w:w="120" w:type="dxa"/>
+            </w:tcMar>
+          </w:tcPr>
+          <w:p>
+            <w:proofErr w:type="spellStart"/>
+            <w:proofErr w:type="gramStart"/>
+            <w:r>
+              <w:rPr>
+                <w:sz w:val="22"/>
+                <w:szCs w:val="22"/>
+              </w:rPr>
+              <w:t>where</w:t>
+            </w:r>
+            <w:proofErr w:type="spellEnd"/>
+            <w:proofErr w:type="gramEnd"/>
+          </w:p>
+        </w:tc>
+        <w:tc>
+          <w:tcPr>
+            <w:tcW w:w="3500" w:type="dxa"/>
+            <w:tcBorders>
+              <w:top w:val="single" w:sz="1" w:space="0" w:color="CCCCCC"/>
+              <w:left w:val="single" w:sz="1" w:space="0" w:color="CCCCCC"/>
+              <w:bottom w:val="single" w:sz="1" w:space="0" w:color="CCCCCC"/>
+              <w:right w:val="single" w:sz="1" w:space="0" w:color="CCCCCC"/>
+            </w:tcBorders>
+            <w:shd w:val="clear" w:color="auto" w:fill="FFFFFF"/>
+            <w:tcMar>
+              <w:top w:w="80" w:type="dxa"/>
+              <w:left w:w="120" w:type="dxa"/>
+              <w:bottom w:w="80" w:type="dxa"/>
+              <w:right w:w="120" w:type="dxa"/>
+            </w:tcMar>
+          </w:tcPr>
+          <w:p>
+            <w:proofErr w:type="spellStart"/>
+            <w:proofErr w:type="gramStart"/>
+            <w:r>
+              <w:rPr>
+                <w:sz w:val="22"/>
+                <w:szCs w:val="22"/>
+              </w:rPr>
+              <w:t>lastdate</w:t>
+            </w:r>
+            <w:proofErr w:type="gramEnd"/>
+            <w:r>
+              <w:rPr>
+                <w:sz w:val="22"/>
+                <w:szCs w:val="22"/>
+              </w:rPr>
+              <w:t>_end</w:t>
+            </w:r>
+            <w:proofErr w:type="spellEnd"/>
+            <w:r>
+              <w:rPr>
+                <w:sz w:val="22"/>
+                <w:szCs w:val="22"/>
+              </w:rPr>
+              <w:t xml:space="preserve"> &gt;= </w:t>
+            </w:r>
+            <w:proofErr w:type="spellStart"/>
+            <w:r>
+              <w:rPr>
+                <w:sz w:val="22"/>
+                <w:szCs w:val="22"/>
+              </w:rPr>
+              <w:t>date_il_y_a_un_an</w:t>
+            </w:r>
+            <w:proofErr w:type="spellEnd"/>
+          </w:p>
+        </w:tc>
+        <w:tc>
+          <w:tcPr>
+            <w:tcW w:w="3200" w:type="dxa"/>
+            <w:tcBorders>
+              <w:top w:val="single" w:sz="1" w:space="0" w:color="CCCCCC"/>
+              <w:left w:val="single" w:sz="1" w:space="0" w:color="CCCCCC"/>
+              <w:bottom w:val="single" w:sz="1" w:space="0" w:color="CCCCCC"/>
+              <w:right w:val="single" w:sz="1" w:space="0" w:color="CCCCCC"/>
+            </w:tcBorders>
+            <w:shd w:val="clear" w:color="auto" w:fill="FFFFFF"/>
+            <w:tcMar>
+              <w:top w:w="80" w:type="dxa"/>
+              <w:left w:w="120" w:type="dxa"/>
+              <w:bottom w:w="80" w:type="dxa"/>
+              <w:right w:w="120" w:type="dxa"/>
+            </w:tcMar>
+          </w:tcPr>
+          <w:p>
+            <w:r>
+              <w:rPr>
+                <w:sz w:val="22"/>
+                <w:szCs w:val="22"/>
+              </w:rPr>
+              <w:t>Filtre temporel — événements de moins d'un an</w:t>
+            </w:r>
+          </w:p>
+        </w:tc>
+      </w:tr>
+      <w:tr>
+        <w:tblPrEx>
+          <w:tblCellMar>
+            <w:top w:w="0" w:type="dxa"/>
+            <w:bottom w:w="0" w:type="dxa"/>
+          </w:tblCellMar>
+        </w:tblPrEx>
+        <w:tc>
+          <w:tcPr>
+            <w:tcW w:w="2200" w:type="dxa"/>
+            <w:tcBorders>
+              <w:top w:val="single" w:sz="1" w:space="0" w:color="CCCCCC"/>
+              <w:left w:val="single" w:sz="1" w:space="0" w:color="CCCCCC"/>
+              <w:bottom w:val="single" w:sz="1" w:space="0" w:color="CCCCCC"/>
+              <w:right w:val="single" w:sz="1" w:space="0" w:color="CCCCCC"/>
+            </w:tcBorders>
+            <w:shd w:val="clear" w:color="auto" w:fill="F5F5F5"/>
+            <w:tcMar>
+              <w:top w:w="80" w:type="dxa"/>
+              <w:left w:w="120" w:type="dxa"/>
+              <w:bottom w:w="80" w:type="dxa"/>
+              <w:right w:w="120" w:type="dxa"/>
+            </w:tcMar>
+          </w:tcPr>
+          <w:p>
+            <w:proofErr w:type="spellStart"/>
+            <w:proofErr w:type="gramStart"/>
+            <w:r>
+              <w:rPr>
+                <w:sz w:val="22"/>
+                <w:szCs w:val="22"/>
+              </w:rPr>
+              <w:t>limit</w:t>
+            </w:r>
+            <w:proofErr w:type="spellEnd"/>
+            <w:proofErr w:type="gramEnd"/>
+          </w:p>
+        </w:tc>
+        <w:tc>
+          <w:tcPr>
+            <w:tcW w:w="3500" w:type="dxa"/>
+            <w:tcBorders>
+              <w:top w:val="single" w:sz="1" w:space="0" w:color="CCCCCC"/>
+              <w:left w:val="single" w:sz="1" w:space="0" w:color="CCCCCC"/>
+              <w:bottom w:val="single" w:sz="1" w:space="0" w:color="CCCCCC"/>
+              <w:right w:val="single" w:sz="1" w:space="0" w:color="CCCCCC"/>
+            </w:tcBorders>
+            <w:shd w:val="clear" w:color="auto" w:fill="F5F5F5"/>
+            <w:tcMar>
+              <w:top w:w="80" w:type="dxa"/>
+              <w:left w:w="120" w:type="dxa"/>
+              <w:bottom w:w="80" w:type="dxa"/>
+              <w:right w:w="120" w:type="dxa"/>
+            </w:tcMar>
+          </w:tcPr>
+          <w:p>
+            <w:r>
+              <w:rPr>
+                <w:sz w:val="22"/>
+                <w:szCs w:val="22"/>
+              </w:rPr>
+              <w:t>100 (par page)</w:t>
+            </w:r>
+          </w:p>
+        </w:tc>
+        <w:tc>
+          <w:tcPr>
+            <w:tcW w:w="3200" w:type="dxa"/>
+            <w:tcBorders>
+              <w:top w:val="single" w:sz="1" w:space="0" w:color="CCCCCC"/>
+              <w:left w:val="single" w:sz="1" w:space="0" w:color="CCCCCC"/>
+              <w:bottom w:val="single" w:sz="1" w:space="0" w:color="CCCCCC"/>
+              <w:right w:val="single" w:sz="1" w:space="0" w:color="CCCCCC"/>
+            </w:tcBorders>
+            <w:shd w:val="clear" w:color="auto" w:fill="F5F5F5"/>
+            <w:tcMar>
+              <w:top w:w="80" w:type="dxa"/>
+              <w:left w:w="120" w:type="dxa"/>
+              <w:bottom w:w="80" w:type="dxa"/>
+              <w:right w:w="120" w:type="dxa"/>
+            </w:tcMar>
+          </w:tcPr>
+          <w:p>
+            <w:r>
+              <w:rPr>
+                <w:sz w:val="22"/>
+                <w:szCs w:val="22"/>
+              </w:rPr>
+              <w:t>Pagination — 100 résultats par appel</w:t>
+            </w:r>
+          </w:p>
+        </w:tc>
+      </w:tr>
+    </w:tbl>
+    <w:p>
+      <w:pPr>
+        <w:spacing w:before="100" w:after="100"/>
+      </w:pPr>
+    </w:p>
+    <w:p>
+      <w:pPr>
+        <w:pStyle w:val="Titre2"/>
+      </w:pPr>
+      <w:r>
+        <w:t>3.2 Stratégie de contournement de la limite API</w:t>
+      </w:r>
+    </w:p>
+    <w:p>
+      <w:pPr>
+        <w:spacing w:before="100" w:after="100"/>
+        <w:jc w:val="both"/>
+      </w:pPr>
+      <w:r>
+        <w:t xml:space="preserve">L'API </w:t>
+      </w:r>
+      <w:proofErr w:type="spellStart"/>
+      <w:r>
+        <w:t>OpenDataSoft</w:t>
+      </w:r>
+      <w:proofErr w:type="spellEnd"/>
+      <w:r>
+        <w:t xml:space="preserve"> impose une limite de 10 000 résultats maximum par requête (offset + </w:t>
+      </w:r>
+      <w:proofErr w:type="spellStart"/>
+      <w:r>
+        <w:t>limit</w:t>
+      </w:r>
+      <w:proofErr w:type="spellEnd"/>
+      <w:r>
+        <w:t xml:space="preserve"> &lt;= 10 000). Pour contourner cette limitation et récupérer l'intégralité des événements, une stratégie en deux passes a été mise en place :</w:t>
+      </w:r>
+    </w:p>
+    <w:p>
+      <w:pPr>
+        <w:spacing w:before="100" w:after="100"/>
+      </w:pPr>
     </w:p>
     <w:p>
       <w:pPr>
@@ -1629,10 +1626,10 @@
         <w:spacing w:before="60" w:after="60"/>
       </w:pPr>
       <w:r>
-        <w:t>Normalisation des sauts de ligne</w:t>
-      </w:r>
-      <w:r>
-        <w:t xml:space="preserve"> et tabulations : les caractères \n, \r, \t sont remplacés par des espaces</w:t>
+        <w:t xml:space="preserve">Passe 1 : récupération </w:t>
+      </w:r>
+      <w:r>
+        <w:t>des événements de Bordeaux uniquement (6 571 événements)</w:t>
       </w:r>
     </w:p>
     <w:p>
@@ -1645,7 +1642,7 @@
         <w:spacing w:before="60" w:after="60"/>
       </w:pPr>
       <w:r>
-        <w:t>Suppression des espaces multiples : les espaces consécutifs sont réduits à un seul espace</w:t>
+        <w:t>Passe 2 : récupération des événements du reste de la Gironde (6 367 événements)</w:t>
       </w:r>
     </w:p>
     <w:p>
@@ -1658,29 +1655,497 @@
         <w:spacing w:before="60" w:after="60"/>
       </w:pPr>
       <w:r>
-        <w:t xml:space="preserve">Application sur toutes les colonnes texte : titre, description, </w:t>
+        <w:t>Fusion des deux passes avec suppression des doublons sur l'identifiant unique (</w:t>
       </w:r>
       <w:proofErr w:type="spellStart"/>
       <w:r>
-        <w:t>description_longue</w:t>
+        <w:t>uid</w:t>
       </w:r>
       <w:proofErr w:type="spellEnd"/>
       <w:r>
-        <w:t>, adresse</w:t>
-      </w:r>
-      <w:r>
-        <w:t xml:space="preserve">, lieu, ville, </w:t>
-      </w:r>
-      <w:proofErr w:type="spellStart"/>
-      <w:r>
-        <w:t>date_affichee</w:t>
-      </w:r>
-      <w:proofErr w:type="spellEnd"/>
+        <w:t>)</w:t>
+      </w:r>
     </w:p>
     <w:p>
       <w:pPr>
         <w:spacing w:before="100" w:after="100"/>
       </w:pPr>
+    </w:p>
+    <w:tbl>
+      <w:tblPr>
+        <w:tblW w:w="8926" w:type="dxa"/>
+        <w:tblBorders>
+          <w:top w:val="single" w:sz="4" w:space="0" w:color="auto"/>
+          <w:left w:val="single" w:sz="4" w:space="0" w:color="auto"/>
+          <w:bottom w:val="single" w:sz="4" w:space="0" w:color="auto"/>
+          <w:right w:val="single" w:sz="4" w:space="0" w:color="auto"/>
+          <w:insideH w:val="single" w:sz="4" w:space="0" w:color="auto"/>
+          <w:insideV w:val="single" w:sz="4" w:space="0" w:color="auto"/>
+        </w:tblBorders>
+        <w:tblCellMar>
+          <w:left w:w="10" w:type="dxa"/>
+          <w:right w:w="10" w:type="dxa"/>
+        </w:tblCellMar>
+        <w:tblLook w:val="04A0" w:firstRow="1" w:lastRow="0" w:firstColumn="1" w:lastColumn="0" w:noHBand="0" w:noVBand="1"/>
+      </w:tblPr>
+      <w:tblGrid>
+        <w:gridCol w:w="4500"/>
+        <w:gridCol w:w="4426"/>
+      </w:tblGrid>
+      <w:tr>
+        <w:tblPrEx>
+          <w:tblCellMar>
+            <w:top w:w="0" w:type="dxa"/>
+            <w:bottom w:w="0" w:type="dxa"/>
+          </w:tblCellMar>
+        </w:tblPrEx>
+        <w:tc>
+          <w:tcPr>
+            <w:tcW w:w="4500" w:type="dxa"/>
+            <w:tcBorders>
+              <w:top w:val="single" w:sz="1" w:space="0" w:color="2E75B6"/>
+              <w:left w:val="single" w:sz="1" w:space="0" w:color="2E75B6"/>
+              <w:bottom w:val="single" w:sz="1" w:space="0" w:color="2E75B6"/>
+              <w:right w:val="single" w:sz="1" w:space="0" w:color="2E75B6"/>
+            </w:tcBorders>
+            <w:shd w:val="clear" w:color="auto" w:fill="2E75B6"/>
+            <w:tcMar>
+              <w:top w:w="80" w:type="dxa"/>
+              <w:left w:w="120" w:type="dxa"/>
+              <w:bottom w:w="80" w:type="dxa"/>
+              <w:right w:w="120" w:type="dxa"/>
+            </w:tcMar>
+          </w:tcPr>
+          <w:p>
+            <w:r>
+              <w:rPr>
+                <w:b/>
+                <w:bCs/>
+                <w:color w:val="FFFFFF"/>
+                <w:sz w:val="22"/>
+                <w:szCs w:val="22"/>
+              </w:rPr>
+              <w:t>Étape</w:t>
+            </w:r>
+          </w:p>
+        </w:tc>
+        <w:tc>
+          <w:tcPr>
+            <w:tcW w:w="4426" w:type="dxa"/>
+            <w:tcBorders>
+              <w:top w:val="single" w:sz="1" w:space="0" w:color="2E75B6"/>
+              <w:left w:val="single" w:sz="1" w:space="0" w:color="2E75B6"/>
+              <w:bottom w:val="single" w:sz="1" w:space="0" w:color="2E75B6"/>
+              <w:right w:val="single" w:sz="1" w:space="0" w:color="2E75B6"/>
+            </w:tcBorders>
+            <w:shd w:val="clear" w:color="auto" w:fill="2E75B6"/>
+            <w:tcMar>
+              <w:top w:w="80" w:type="dxa"/>
+              <w:left w:w="120" w:type="dxa"/>
+              <w:bottom w:w="80" w:type="dxa"/>
+              <w:right w:w="120" w:type="dxa"/>
+            </w:tcMar>
+          </w:tcPr>
+          <w:p>
+            <w:r>
+              <w:rPr>
+                <w:b/>
+                <w:bCs/>
+                <w:color w:val="FFFFFF"/>
+                <w:sz w:val="22"/>
+                <w:szCs w:val="22"/>
+              </w:rPr>
+              <w:t>Résultat</w:t>
+            </w:r>
+          </w:p>
+        </w:tc>
+      </w:tr>
+      <w:tr>
+        <w:tblPrEx>
+          <w:tblCellMar>
+            <w:top w:w="0" w:type="dxa"/>
+            <w:bottom w:w="0" w:type="dxa"/>
+          </w:tblCellMar>
+        </w:tblPrEx>
+        <w:tc>
+          <w:tcPr>
+            <w:tcW w:w="4500" w:type="dxa"/>
+            <w:tcBorders>
+              <w:top w:val="single" w:sz="1" w:space="0" w:color="CCCCCC"/>
+              <w:left w:val="single" w:sz="1" w:space="0" w:color="CCCCCC"/>
+              <w:bottom w:val="single" w:sz="1" w:space="0" w:color="CCCCCC"/>
+              <w:right w:val="single" w:sz="1" w:space="0" w:color="CCCCCC"/>
+            </w:tcBorders>
+            <w:shd w:val="clear" w:color="auto" w:fill="F5F5F5"/>
+            <w:tcMar>
+              <w:top w:w="80" w:type="dxa"/>
+              <w:left w:w="120" w:type="dxa"/>
+              <w:bottom w:w="80" w:type="dxa"/>
+              <w:right w:w="120" w:type="dxa"/>
+            </w:tcMar>
+          </w:tcPr>
+          <w:p>
+            <w:r>
+              <w:rPr>
+                <w:sz w:val="22"/>
+                <w:szCs w:val="22"/>
+              </w:rPr>
+              <w:t>Passe 1 — Bordeaux</w:t>
+            </w:r>
+          </w:p>
+        </w:tc>
+        <w:tc>
+          <w:tcPr>
+            <w:tcW w:w="4426" w:type="dxa"/>
+            <w:tcBorders>
+              <w:top w:val="single" w:sz="1" w:space="0" w:color="CCCCCC"/>
+              <w:left w:val="single" w:sz="1" w:space="0" w:color="CCCCCC"/>
+              <w:bottom w:val="single" w:sz="1" w:space="0" w:color="CCCCCC"/>
+              <w:right w:val="single" w:sz="1" w:space="0" w:color="CCCCCC"/>
+            </w:tcBorders>
+            <w:shd w:val="clear" w:color="auto" w:fill="F5F5F5"/>
+            <w:tcMar>
+              <w:top w:w="80" w:type="dxa"/>
+              <w:left w:w="120" w:type="dxa"/>
+              <w:bottom w:w="80" w:type="dxa"/>
+              <w:right w:w="120" w:type="dxa"/>
+            </w:tcMar>
+          </w:tcPr>
+          <w:p>
+            <w:r>
+              <w:rPr>
+                <w:sz w:val="22"/>
+                <w:szCs w:val="22"/>
+              </w:rPr>
+              <w:t>6 571 événements</w:t>
+            </w:r>
+          </w:p>
+        </w:tc>
+      </w:tr>
+      <w:tr>
+        <w:tblPrEx>
+          <w:tblCellMar>
+            <w:top w:w="0" w:type="dxa"/>
+            <w:bottom w:w="0" w:type="dxa"/>
+          </w:tblCellMar>
+        </w:tblPrEx>
+        <w:tc>
+          <w:tcPr>
+            <w:tcW w:w="4500" w:type="dxa"/>
+            <w:tcBorders>
+              <w:top w:val="single" w:sz="1" w:space="0" w:color="CCCCCC"/>
+              <w:left w:val="single" w:sz="1" w:space="0" w:color="CCCCCC"/>
+              <w:bottom w:val="single" w:sz="1" w:space="0" w:color="CCCCCC"/>
+              <w:right w:val="single" w:sz="1" w:space="0" w:color="CCCCCC"/>
+            </w:tcBorders>
+            <w:shd w:val="clear" w:color="auto" w:fill="FFFFFF"/>
+            <w:tcMar>
+              <w:top w:w="80" w:type="dxa"/>
+              <w:left w:w="120" w:type="dxa"/>
+              <w:bottom w:w="80" w:type="dxa"/>
+              <w:right w:w="120" w:type="dxa"/>
+            </w:tcMar>
+          </w:tcPr>
+          <w:p>
+            <w:r>
+              <w:rPr>
+                <w:sz w:val="22"/>
+                <w:szCs w:val="22"/>
+              </w:rPr>
+              <w:t>Passe 2 — Reste de la Gironde</w:t>
+            </w:r>
+          </w:p>
+        </w:tc>
+        <w:tc>
+          <w:tcPr>
+            <w:tcW w:w="4426" w:type="dxa"/>
+            <w:tcBorders>
+              <w:top w:val="single" w:sz="1" w:space="0" w:color="CCCCCC"/>
+              <w:left w:val="single" w:sz="1" w:space="0" w:color="CCCCCC"/>
+              <w:bottom w:val="single" w:sz="1" w:space="0" w:color="CCCCCC"/>
+              <w:right w:val="single" w:sz="1" w:space="0" w:color="CCCCCC"/>
+            </w:tcBorders>
+            <w:shd w:val="clear" w:color="auto" w:fill="FFFFFF"/>
+            <w:tcMar>
+              <w:top w:w="80" w:type="dxa"/>
+              <w:left w:w="120" w:type="dxa"/>
+              <w:bottom w:w="80" w:type="dxa"/>
+              <w:right w:w="120" w:type="dxa"/>
+            </w:tcMar>
+          </w:tcPr>
+          <w:p>
+            <w:r>
+              <w:rPr>
+                <w:sz w:val="22"/>
+                <w:szCs w:val="22"/>
+              </w:rPr>
+              <w:t>6 367 événements</w:t>
+            </w:r>
+          </w:p>
+        </w:tc>
+      </w:tr>
+      <w:tr>
+        <w:tblPrEx>
+          <w:tblCellMar>
+            <w:top w:w="0" w:type="dxa"/>
+            <w:bottom w:w="0" w:type="dxa"/>
+          </w:tblCellMar>
+        </w:tblPrEx>
+        <w:tc>
+          <w:tcPr>
+            <w:tcW w:w="4500" w:type="dxa"/>
+            <w:tcBorders>
+              <w:top w:val="single" w:sz="1" w:space="0" w:color="CCCCCC"/>
+              <w:left w:val="single" w:sz="1" w:space="0" w:color="CCCCCC"/>
+              <w:bottom w:val="single" w:sz="1" w:space="0" w:color="CCCCCC"/>
+              <w:right w:val="single" w:sz="1" w:space="0" w:color="CCCCCC"/>
+            </w:tcBorders>
+            <w:shd w:val="clear" w:color="auto" w:fill="F5F5F5"/>
+            <w:tcMar>
+              <w:top w:w="80" w:type="dxa"/>
+              <w:left w:w="120" w:type="dxa"/>
+              <w:bottom w:w="80" w:type="dxa"/>
+              <w:right w:w="120" w:type="dxa"/>
+            </w:tcMar>
+          </w:tcPr>
+          <w:p>
+            <w:r>
+              <w:rPr>
+                <w:sz w:val="22"/>
+                <w:szCs w:val="22"/>
+              </w:rPr>
+              <w:t>Total avant déduplication</w:t>
+            </w:r>
+          </w:p>
+        </w:tc>
+        <w:tc>
+          <w:tcPr>
+            <w:tcW w:w="4426" w:type="dxa"/>
+            <w:tcBorders>
+              <w:top w:val="single" w:sz="1" w:space="0" w:color="CCCCCC"/>
+              <w:left w:val="single" w:sz="1" w:space="0" w:color="CCCCCC"/>
+              <w:bottom w:val="single" w:sz="1" w:space="0" w:color="CCCCCC"/>
+              <w:right w:val="single" w:sz="1" w:space="0" w:color="CCCCCC"/>
+            </w:tcBorders>
+            <w:shd w:val="clear" w:color="auto" w:fill="F5F5F5"/>
+            <w:tcMar>
+              <w:top w:w="80" w:type="dxa"/>
+              <w:left w:w="120" w:type="dxa"/>
+              <w:bottom w:w="80" w:type="dxa"/>
+              <w:right w:w="120" w:type="dxa"/>
+            </w:tcMar>
+          </w:tcPr>
+          <w:p>
+            <w:r>
+              <w:rPr>
+                <w:sz w:val="22"/>
+                <w:szCs w:val="22"/>
+              </w:rPr>
+              <w:t>12 938 événements</w:t>
+            </w:r>
+          </w:p>
+        </w:tc>
+      </w:tr>
+      <w:tr>
+        <w:tblPrEx>
+          <w:tblCellMar>
+            <w:top w:w="0" w:type="dxa"/>
+            <w:bottom w:w="0" w:type="dxa"/>
+          </w:tblCellMar>
+        </w:tblPrEx>
+        <w:tc>
+          <w:tcPr>
+            <w:tcW w:w="4500" w:type="dxa"/>
+            <w:tcBorders>
+              <w:top w:val="single" w:sz="1" w:space="0" w:color="CCCCCC"/>
+              <w:left w:val="single" w:sz="1" w:space="0" w:color="CCCCCC"/>
+              <w:bottom w:val="single" w:sz="1" w:space="0" w:color="CCCCCC"/>
+              <w:right w:val="single" w:sz="1" w:space="0" w:color="CCCCCC"/>
+            </w:tcBorders>
+            <w:shd w:val="clear" w:color="auto" w:fill="FFFFFF"/>
+            <w:tcMar>
+              <w:top w:w="80" w:type="dxa"/>
+              <w:left w:w="120" w:type="dxa"/>
+              <w:bottom w:w="80" w:type="dxa"/>
+              <w:right w:w="120" w:type="dxa"/>
+            </w:tcMar>
+          </w:tcPr>
+          <w:p>
+            <w:r>
+              <w:rPr>
+                <w:sz w:val="22"/>
+                <w:szCs w:val="22"/>
+              </w:rPr>
+              <w:t>Total après déduplication</w:t>
+            </w:r>
+          </w:p>
+        </w:tc>
+        <w:tc>
+          <w:tcPr>
+            <w:tcW w:w="4426" w:type="dxa"/>
+            <w:tcBorders>
+              <w:top w:val="single" w:sz="1" w:space="0" w:color="CCCCCC"/>
+              <w:left w:val="single" w:sz="1" w:space="0" w:color="CCCCCC"/>
+              <w:bottom w:val="single" w:sz="1" w:space="0" w:color="CCCCCC"/>
+              <w:right w:val="single" w:sz="1" w:space="0" w:color="CCCCCC"/>
+            </w:tcBorders>
+            <w:shd w:val="clear" w:color="auto" w:fill="FFFFFF"/>
+            <w:tcMar>
+              <w:top w:w="80" w:type="dxa"/>
+              <w:left w:w="120" w:type="dxa"/>
+              <w:bottom w:w="80" w:type="dxa"/>
+              <w:right w:w="120" w:type="dxa"/>
+            </w:tcMar>
+          </w:tcPr>
+          <w:p>
+            <w:r>
+              <w:rPr>
+                <w:sz w:val="22"/>
+                <w:szCs w:val="22"/>
+              </w:rPr>
+              <w:t>12 872 événements</w:t>
+            </w:r>
+          </w:p>
+        </w:tc>
+      </w:tr>
+      <w:tr>
+        <w:tblPrEx>
+          <w:tblCellMar>
+            <w:top w:w="0" w:type="dxa"/>
+            <w:bottom w:w="0" w:type="dxa"/>
+          </w:tblCellMar>
+        </w:tblPrEx>
+        <w:tc>
+          <w:tcPr>
+            <w:tcW w:w="4500" w:type="dxa"/>
+            <w:tcBorders>
+              <w:top w:val="single" w:sz="1" w:space="0" w:color="CCCCCC"/>
+              <w:left w:val="single" w:sz="1" w:space="0" w:color="CCCCCC"/>
+              <w:bottom w:val="single" w:sz="1" w:space="0" w:color="CCCCCC"/>
+              <w:right w:val="single" w:sz="1" w:space="0" w:color="CCCCCC"/>
+            </w:tcBorders>
+            <w:shd w:val="clear" w:color="auto" w:fill="F5F5F5"/>
+            <w:tcMar>
+              <w:top w:w="80" w:type="dxa"/>
+              <w:left w:w="120" w:type="dxa"/>
+              <w:bottom w:w="80" w:type="dxa"/>
+              <w:right w:w="120" w:type="dxa"/>
+            </w:tcMar>
+          </w:tcPr>
+          <w:p>
+            <w:r>
+              <w:rPr>
+                <w:sz w:val="22"/>
+                <w:szCs w:val="22"/>
+              </w:rPr>
+              <w:lastRenderedPageBreak/>
+              <w:t>Après nettoyage complet</w:t>
+            </w:r>
+          </w:p>
+        </w:tc>
+        <w:tc>
+          <w:tcPr>
+            <w:tcW w:w="4426" w:type="dxa"/>
+            <w:tcBorders>
+              <w:top w:val="single" w:sz="1" w:space="0" w:color="CCCCCC"/>
+              <w:left w:val="single" w:sz="1" w:space="0" w:color="CCCCCC"/>
+              <w:bottom w:val="single" w:sz="1" w:space="0" w:color="CCCCCC"/>
+              <w:right w:val="single" w:sz="1" w:space="0" w:color="CCCCCC"/>
+            </w:tcBorders>
+            <w:shd w:val="clear" w:color="auto" w:fill="F5F5F5"/>
+            <w:tcMar>
+              <w:top w:w="80" w:type="dxa"/>
+              <w:left w:w="120" w:type="dxa"/>
+              <w:bottom w:w="80" w:type="dxa"/>
+              <w:right w:w="120" w:type="dxa"/>
+            </w:tcMar>
+          </w:tcPr>
+          <w:p>
+            <w:r>
+              <w:rPr>
+                <w:sz w:val="22"/>
+                <w:szCs w:val="22"/>
+              </w:rPr>
+              <w:t>12 869 événements</w:t>
+            </w:r>
+          </w:p>
+        </w:tc>
+      </w:tr>
+      <w:tr>
+        <w:tblPrEx>
+          <w:tblCellMar>
+            <w:top w:w="0" w:type="dxa"/>
+            <w:bottom w:w="0" w:type="dxa"/>
+          </w:tblCellMar>
+        </w:tblPrEx>
+        <w:tc>
+          <w:tcPr>
+            <w:tcW w:w="4500" w:type="dxa"/>
+            <w:tcBorders>
+              <w:top w:val="single" w:sz="1" w:space="0" w:color="CCCCCC"/>
+              <w:left w:val="single" w:sz="1" w:space="0" w:color="CCCCCC"/>
+              <w:bottom w:val="single" w:sz="1" w:space="0" w:color="CCCCCC"/>
+              <w:right w:val="single" w:sz="1" w:space="0" w:color="CCCCCC"/>
+            </w:tcBorders>
+            <w:shd w:val="clear" w:color="auto" w:fill="FFFFFF"/>
+            <w:tcMar>
+              <w:top w:w="80" w:type="dxa"/>
+              <w:left w:w="120" w:type="dxa"/>
+              <w:bottom w:w="80" w:type="dxa"/>
+              <w:right w:w="120" w:type="dxa"/>
+            </w:tcMar>
+          </w:tcPr>
+          <w:p>
+            <w:r>
+              <w:rPr>
+                <w:sz w:val="22"/>
+                <w:szCs w:val="22"/>
+              </w:rPr>
+              <w:t>Vecteurs dans l'index FAISS</w:t>
+            </w:r>
+          </w:p>
+        </w:tc>
+        <w:tc>
+          <w:tcPr>
+            <w:tcW w:w="4426" w:type="dxa"/>
+            <w:tcBorders>
+              <w:top w:val="single" w:sz="1" w:space="0" w:color="CCCCCC"/>
+              <w:left w:val="single" w:sz="1" w:space="0" w:color="CCCCCC"/>
+              <w:bottom w:val="single" w:sz="1" w:space="0" w:color="CCCCCC"/>
+              <w:right w:val="single" w:sz="1" w:space="0" w:color="CCCCCC"/>
+            </w:tcBorders>
+            <w:shd w:val="clear" w:color="auto" w:fill="FFFFFF"/>
+            <w:tcMar>
+              <w:top w:w="80" w:type="dxa"/>
+              <w:left w:w="120" w:type="dxa"/>
+              <w:bottom w:w="80" w:type="dxa"/>
+              <w:right w:w="120" w:type="dxa"/>
+            </w:tcMar>
+          </w:tcPr>
+          <w:p>
+            <w:r>
+              <w:rPr>
+                <w:sz w:val="22"/>
+                <w:szCs w:val="22"/>
+              </w:rPr>
+              <w:t>12 869 vecteurs</w:t>
+            </w:r>
+          </w:p>
+        </w:tc>
+      </w:tr>
+    </w:tbl>
+    <w:p>
+      <w:pPr>
+        <w:spacing w:before="100" w:after="100"/>
+      </w:pPr>
+    </w:p>
+    <w:p>
+      <w:pPr>
+        <w:pStyle w:val="Titre2"/>
+      </w:pPr>
+      <w:r>
+        <w:t>3.3 Processus de nettoyage des données</w:t>
+      </w:r>
     </w:p>
     <w:p>
       <w:pPr>
@@ -1688,23 +2153,163 @@
         <w:jc w:val="both"/>
       </w:pPr>
       <w:r>
-        <w:t xml:space="preserve">Ce nettoyage est appliqué dès la lecture du JSON source dans 01_fetch_data.py pour la </w:t>
+        <w:t>Un processus de nettoyage rigoureux a été appliqué dès la récupération des données depuis l'API, puis complété lors du pré-</w:t>
       </w:r>
       <w:proofErr w:type="spellStart"/>
       <w:r>
+        <w:t>processing</w:t>
+      </w:r>
+      <w:proofErr w:type="spellEnd"/>
+      <w:r>
+        <w:t xml:space="preserve"> :</w:t>
+      </w:r>
+    </w:p>
+    <w:p>
+      <w:pPr>
+        <w:spacing w:before="100" w:after="100"/>
+      </w:pPr>
+    </w:p>
+    <w:p>
+      <w:pPr>
+        <w:pStyle w:val="Paragraphedeliste"/>
+        <w:numPr>
+          <w:ilvl w:val="0"/>
+          <w:numId w:val="2"/>
+        </w:numPr>
+        <w:spacing w:before="60" w:after="60"/>
+      </w:pPr>
+      <w:r>
+        <w:t>Suppression des balises HTML : les descriptions contiennent des balises &lt;p&gt;, &lt;</w:t>
+      </w:r>
+      <w:proofErr w:type="spellStart"/>
+      <w:r>
+        <w:t>ul</w:t>
+      </w:r>
+      <w:proofErr w:type="spellEnd"/>
+      <w:r>
+        <w:t>&gt;, &lt;li&gt;, &lt;</w:t>
+      </w:r>
+      <w:proofErr w:type="spellStart"/>
+      <w:r>
+        <w:t>em</w:t>
+      </w:r>
+      <w:proofErr w:type="spellEnd"/>
+      <w:r>
+        <w:t>&gt; supprimées via expression</w:t>
+      </w:r>
+      <w:r>
+        <w:t xml:space="preserve"> régulière</w:t>
+      </w:r>
+    </w:p>
+    <w:p>
+      <w:pPr>
+        <w:pStyle w:val="Paragraphedeliste"/>
+        <w:numPr>
+          <w:ilvl w:val="0"/>
+          <w:numId w:val="2"/>
+        </w:numPr>
+        <w:spacing w:before="60" w:after="60"/>
+      </w:pPr>
+      <w:r>
+        <w:t>Suppression des entités HTML : les entités comme &amp;</w:t>
+      </w:r>
+      <w:proofErr w:type="spellStart"/>
+      <w:proofErr w:type="gramStart"/>
+      <w:r>
+        <w:t>amp</w:t>
+      </w:r>
+      <w:proofErr w:type="spellEnd"/>
+      <w:r>
+        <w:t>;,</w:t>
+      </w:r>
+      <w:proofErr w:type="gramEnd"/>
+      <w:r>
+        <w:t xml:space="preserve"> &amp;</w:t>
+      </w:r>
+      <w:proofErr w:type="spellStart"/>
+      <w:r>
+        <w:t>nbsp</w:t>
+      </w:r>
+      <w:proofErr w:type="spellEnd"/>
+      <w:r>
+        <w:t>;, &amp;#9; sont également supprimées</w:t>
+      </w:r>
+    </w:p>
+    <w:p>
+      <w:pPr>
+        <w:pStyle w:val="Paragraphedeliste"/>
+        <w:numPr>
+          <w:ilvl w:val="0"/>
+          <w:numId w:val="2"/>
+        </w:numPr>
+        <w:spacing w:before="60" w:after="60"/>
+      </w:pPr>
+      <w:r>
+        <w:t>Correction des caractères mal encodés : les textes encodés en latin1 (</w:t>
+      </w:r>
+      <w:proofErr w:type="gramStart"/>
+      <w:r>
+        <w:t>ex:</w:t>
+      </w:r>
+      <w:proofErr w:type="gramEnd"/>
+      <w:r>
+        <w:t xml:space="preserve"> Ã©, Â) sont corrigés</w:t>
+      </w:r>
+    </w:p>
+    <w:p>
+      <w:pPr>
+        <w:pStyle w:val="Paragraphedeliste"/>
+        <w:numPr>
+          <w:ilvl w:val="0"/>
+          <w:numId w:val="2"/>
+        </w:numPr>
+        <w:spacing w:before="60" w:after="60"/>
+      </w:pPr>
+      <w:r>
+        <w:t>Normalisation des sauts de ligne et tabulations : les c</w:t>
+      </w:r>
+      <w:r>
+        <w:t>aractères \n, \r, \t sont remplacés par des espaces</w:t>
+      </w:r>
+    </w:p>
+    <w:p>
+      <w:pPr>
+        <w:pStyle w:val="Paragraphedeliste"/>
+        <w:numPr>
+          <w:ilvl w:val="0"/>
+          <w:numId w:val="2"/>
+        </w:numPr>
+        <w:spacing w:before="60" w:after="60"/>
+      </w:pPr>
+      <w:r>
+        <w:t>Suppression des espaces multiples : les espaces consécutifs sont réduits à un seul espace</w:t>
+      </w:r>
+    </w:p>
+    <w:p>
+      <w:pPr>
+        <w:pStyle w:val="Paragraphedeliste"/>
+        <w:numPr>
+          <w:ilvl w:val="0"/>
+          <w:numId w:val="2"/>
+        </w:numPr>
+        <w:spacing w:before="60" w:after="60"/>
+      </w:pPr>
+      <w:r>
+        <w:t xml:space="preserve">Application sur toutes les colonnes texte : titre, description, </w:t>
+      </w:r>
+      <w:proofErr w:type="spellStart"/>
+      <w:r>
         <w:t>description_longue</w:t>
       </w:r>
       <w:proofErr w:type="spellEnd"/>
       <w:r>
-        <w:t xml:space="preserve">, puis complété dans 02_preprocess_data.py pour toutes les </w:t>
-      </w:r>
-      <w:r>
-        <w:lastRenderedPageBreak/>
-        <w:t xml:space="preserve">autres colonnes. Cela garantit que le fichier CSV généré ne contient aucun caractère spécial </w:t>
-      </w:r>
-      <w:r>
-        <w:t>susceptible de corrompre la structure du fichier.</w:t>
-      </w:r>
+        <w:t xml:space="preserve">, adresse, lieu, ville, </w:t>
+      </w:r>
+      <w:proofErr w:type="spellStart"/>
+      <w:r>
+        <w:t>date_affichee</w:t>
+      </w:r>
+      <w:proofErr w:type="spellEnd"/>
     </w:p>
     <w:p>
       <w:pPr>
@@ -1725,7 +2330,10 @@
         <w:jc w:val="both"/>
       </w:pPr>
       <w:r>
-        <w:t>Pour chaque événement, un texte complet est construit en combinant toutes les informations disponibles. Ce texte est ensuite utilisé pour la vectorisation. Exemple :</w:t>
+        <w:t>Pour chaque événement, un texte complet est construit en combinant toutes les informations disponible</w:t>
+      </w:r>
+      <w:r>
+        <w:t>s. Ce texte est utilisé pour la vectorisation :</w:t>
       </w:r>
     </w:p>
     <w:p>
@@ -1736,52 +2344,20 @@
     <w:p>
       <w:pPr>
         <w:spacing w:before="100" w:after="100"/>
+      </w:pPr>
+      <w:r>
         <w:rPr>
           <w:rFonts w:ascii="Courier New" w:eastAsia="Courier New" w:hAnsi="Courier New" w:cs="Courier New"/>
           <w:i/>
           <w:iCs/>
+          <w:color w:val="444444"/>
           <w:sz w:val="20"/>
           <w:szCs w:val="20"/>
         </w:rPr>
-      </w:pPr>
-      <w:r>
-        <w:rPr>
-          <w:rFonts w:ascii="Courier New" w:eastAsia="Courier New" w:hAnsi="Courier New" w:cs="Courier New"/>
-          <w:i/>
-          <w:iCs/>
-          <w:sz w:val="20"/>
-          <w:szCs w:val="20"/>
-        </w:rPr>
-        <w:t>Évén</w:t>
-      </w:r>
-      <w:r>
-        <w:rPr>
-          <w:rFonts w:ascii="Courier New" w:eastAsia="Courier New" w:hAnsi="Courier New" w:cs="Courier New"/>
-          <w:i/>
-          <w:iCs/>
-          <w:sz w:val="20"/>
-          <w:szCs w:val="20"/>
-        </w:rPr>
-        <w:t>ement : Lesparre fête l'Europe | Description : Animations sportives et culturelles autour de l'Europe | Lieu : Plaine de sports | Ville : Lesparre-Médoc | Date : Samedi 30 mai, 10h00</w:t>
-      </w:r>
-    </w:p>
-    <w:p>
-      <w:pPr>
-        <w:spacing w:before="100" w:after="100"/>
-        <w:rPr>
-          <w:rFonts w:ascii="Courier New" w:eastAsia="Courier New" w:hAnsi="Courier New" w:cs="Courier New"/>
-          <w:i/>
-          <w:iCs/>
-          <w:sz w:val="20"/>
-          <w:szCs w:val="20"/>
-        </w:rPr>
-      </w:pPr>
-    </w:p>
-    <w:p>
-      <w:pPr>
-        <w:spacing w:before="100" w:after="100"/>
-      </w:pPr>
-    </w:p>
+        <w:t>Événement : Verdi Requiem | Description : Chœur de l'Opéra National de Bordeaux | Lieu : Auditorium de Bordeaux | Ville : Bordeaux | Date : Vendredi 19 juin, 20h00</w:t>
+      </w:r>
+    </w:p>
+    <w:p/>
     <w:p>
       <w:pPr>
         <w:pStyle w:val="Titre1"/>
@@ -1989,7 +2565,14 @@
                 <w:sz w:val="22"/>
                 <w:szCs w:val="22"/>
               </w:rPr>
-              <w:t>Vectorisation des textes (</w:t>
+              <w:t>Vec</w:t>
+            </w:r>
+            <w:r>
+              <w:rPr>
+                <w:sz w:val="22"/>
+                <w:szCs w:val="22"/>
+              </w:rPr>
+              <w:t>torisation des textes (</w:t>
             </w:r>
             <w:proofErr w:type="spellStart"/>
             <w:r>
@@ -2773,6 +3356,97 @@
             </w:tcMar>
           </w:tcPr>
           <w:p>
+            <w:proofErr w:type="spellStart"/>
+            <w:r>
+              <w:rPr>
+                <w:sz w:val="22"/>
+                <w:szCs w:val="22"/>
+              </w:rPr>
+              <w:t>Requests</w:t>
+            </w:r>
+            <w:proofErr w:type="spellEnd"/>
+          </w:p>
+        </w:tc>
+        <w:tc>
+          <w:tcPr>
+            <w:tcW w:w="1500" w:type="dxa"/>
+            <w:tcBorders>
+              <w:top w:val="single" w:sz="1" w:space="0" w:color="CCCCCC"/>
+              <w:left w:val="single" w:sz="1" w:space="0" w:color="CCCCCC"/>
+              <w:bottom w:val="single" w:sz="1" w:space="0" w:color="CCCCCC"/>
+              <w:right w:val="single" w:sz="1" w:space="0" w:color="CCCCCC"/>
+            </w:tcBorders>
+            <w:shd w:val="clear" w:color="auto" w:fill="FFFFFF"/>
+            <w:tcMar>
+              <w:top w:w="80" w:type="dxa"/>
+              <w:left w:w="120" w:type="dxa"/>
+              <w:bottom w:w="80" w:type="dxa"/>
+              <w:right w:w="120" w:type="dxa"/>
+            </w:tcMar>
+          </w:tcPr>
+          <w:p>
+            <w:r>
+              <w:rPr>
+                <w:sz w:val="22"/>
+                <w:szCs w:val="22"/>
+              </w:rPr>
+              <w:t>2.34.2</w:t>
+            </w:r>
+          </w:p>
+        </w:tc>
+        <w:tc>
+          <w:tcPr>
+            <w:tcW w:w="4600" w:type="dxa"/>
+            <w:tcBorders>
+              <w:top w:val="single" w:sz="1" w:space="0" w:color="CCCCCC"/>
+              <w:left w:val="single" w:sz="1" w:space="0" w:color="CCCCCC"/>
+              <w:bottom w:val="single" w:sz="1" w:space="0" w:color="CCCCCC"/>
+              <w:right w:val="single" w:sz="1" w:space="0" w:color="CCCCCC"/>
+            </w:tcBorders>
+            <w:shd w:val="clear" w:color="auto" w:fill="FFFFFF"/>
+            <w:tcMar>
+              <w:top w:w="80" w:type="dxa"/>
+              <w:left w:w="120" w:type="dxa"/>
+              <w:bottom w:w="80" w:type="dxa"/>
+              <w:right w:w="120" w:type="dxa"/>
+            </w:tcMar>
+          </w:tcPr>
+          <w:p>
+            <w:r>
+              <w:rPr>
+                <w:sz w:val="22"/>
+                <w:szCs w:val="22"/>
+              </w:rPr>
+              <w:t>Appels HTTP vers l'API Open Agenda</w:t>
+            </w:r>
+          </w:p>
+        </w:tc>
+      </w:tr>
+      <w:tr>
+        <w:tblPrEx>
+          <w:tblCellMar>
+            <w:top w:w="0" w:type="dxa"/>
+            <w:bottom w:w="0" w:type="dxa"/>
+          </w:tblCellMar>
+        </w:tblPrEx>
+        <w:tc>
+          <w:tcPr>
+            <w:tcW w:w="2800" w:type="dxa"/>
+            <w:tcBorders>
+              <w:top w:val="single" w:sz="1" w:space="0" w:color="CCCCCC"/>
+              <w:left w:val="single" w:sz="1" w:space="0" w:color="CCCCCC"/>
+              <w:bottom w:val="single" w:sz="1" w:space="0" w:color="CCCCCC"/>
+              <w:right w:val="single" w:sz="1" w:space="0" w:color="CCCCCC"/>
+            </w:tcBorders>
+            <w:shd w:val="clear" w:color="auto" w:fill="F5F5F5"/>
+            <w:tcMar>
+              <w:top w:w="80" w:type="dxa"/>
+              <w:left w:w="120" w:type="dxa"/>
+              <w:bottom w:w="80" w:type="dxa"/>
+              <w:right w:w="120" w:type="dxa"/>
+            </w:tcMar>
+          </w:tcPr>
+          <w:p>
             <w:r>
               <w:rPr>
                 <w:sz w:val="22"/>
@@ -2800,7 +3474,7 @@
               <w:bottom w:val="single" w:sz="1" w:space="0" w:color="CCCCCC"/>
               <w:right w:val="single" w:sz="1" w:space="0" w:color="CCCCCC"/>
             </w:tcBorders>
-            <w:shd w:val="clear" w:color="auto" w:fill="FFFFFF"/>
+            <w:shd w:val="clear" w:color="auto" w:fill="F5F5F5"/>
             <w:tcMar>
               <w:top w:w="80" w:type="dxa"/>
               <w:left w:w="120" w:type="dxa"/>
@@ -2827,21 +3501,21 @@
               <w:bottom w:val="single" w:sz="1" w:space="0" w:color="CCCCCC"/>
               <w:right w:val="single" w:sz="1" w:space="0" w:color="CCCCCC"/>
             </w:tcBorders>
-            <w:shd w:val="clear" w:color="auto" w:fill="FFFFFF"/>
-            <w:tcMar>
-              <w:top w:w="80" w:type="dxa"/>
-              <w:left w:w="120" w:type="dxa"/>
-              <w:bottom w:w="80" w:type="dxa"/>
-              <w:right w:w="120" w:type="dxa"/>
-            </w:tcMar>
-          </w:tcPr>
-          <w:p>
-            <w:r>
-              <w:rPr>
-                <w:sz w:val="22"/>
-                <w:szCs w:val="22"/>
-              </w:rPr>
-              <w:t>Gestion sécurisée de la clé API</w:t>
+            <w:shd w:val="clear" w:color="auto" w:fill="F5F5F5"/>
+            <w:tcMar>
+              <w:top w:w="80" w:type="dxa"/>
+              <w:left w:w="120" w:type="dxa"/>
+              <w:bottom w:w="80" w:type="dxa"/>
+              <w:right w:w="120" w:type="dxa"/>
+            </w:tcMar>
+          </w:tcPr>
+          <w:p>
+            <w:r>
+              <w:rPr>
+                <w:sz w:val="22"/>
+                <w:szCs w:val="22"/>
+              </w:rPr>
+              <w:t>Gestion sécurisée de la clé API Mistral</w:t>
             </w:r>
           </w:p>
         </w:tc>
@@ -2857,8 +3531,7 @@
         <w:pStyle w:val="Titre2"/>
       </w:pPr>
       <w:r>
-        <w:lastRenderedPageBreak/>
-        <w:t>4.3 Justification du choix de FAISS</w:t>
+        <w:t>4.3 Justification du choix de l'API Open Agenda</w:t>
       </w:r>
     </w:p>
     <w:p>
@@ -2871,7 +3544,7 @@
         <w:spacing w:before="60" w:after="60"/>
       </w:pPr>
       <w:r>
-        <w:t>Performance : FAISS est optimisé pour la recherche de similarité sur de grands volumes de données</w:t>
+        <w:t>Données fraîches : l'API retourne toujours les données les plus récentes, contrairement à un fichier statique</w:t>
       </w:r>
     </w:p>
     <w:p>
@@ -2884,13 +3557,8 @@
         <w:spacing w:before="60" w:after="60"/>
       </w:pPr>
       <w:r>
-        <w:t xml:space="preserve">Intégration : FAISS s'intègre nativement avec </w:t>
-      </w:r>
-      <w:proofErr w:type="spellStart"/>
-      <w:r>
-        <w:t>LangChain</w:t>
-      </w:r>
-      <w:proofErr w:type="spellEnd"/>
+        <w:t>Filtrage côté serveur : les filtres géographique et temporel sont appliqués directement dans la requête API</w:t>
+      </w:r>
     </w:p>
     <w:p>
       <w:pPr>
@@ -2902,7 +3570,10 @@
         <w:spacing w:before="60" w:after="60"/>
       </w:pPr>
       <w:r>
-        <w:t>Simplicité : l'algorithme IndexFlatL2 mesure la distance euclidienne entre les vecteurs</w:t>
+        <w:t xml:space="preserve">Pas de fichier lourd : plus besoin de </w:t>
+      </w:r>
+      <w:r>
+        <w:t>stocker un fichier JSON de 4,6 Go en local</w:t>
       </w:r>
     </w:p>
     <w:p>
@@ -2915,10 +3586,7 @@
         <w:spacing w:before="60" w:after="60"/>
       </w:pPr>
       <w:r>
-        <w:t>Gratuit et ope</w:t>
-      </w:r>
-      <w:r>
-        <w:t>n source : pas de coût supplémentaire</w:t>
+        <w:t>Reproductibilité : n'importe qui peut reproduire le projet sans télécharger un fichier volumineux</w:t>
       </w:r>
     </w:p>
     <w:p>
@@ -2931,7 +3599,7 @@
         <w:pStyle w:val="Titre2"/>
       </w:pPr>
       <w:r>
-        <w:t>4.4 Justification du choix de all-MiniLM-L6-v2</w:t>
+        <w:t>4.4 Justification du choix de FAISS</w:t>
       </w:r>
     </w:p>
     <w:p>
@@ -2944,7 +3612,10 @@
         <w:spacing w:before="60" w:after="60"/>
       </w:pPr>
       <w:r>
-        <w:t>Gratuité totale : aucune clé API ni coût</w:t>
+        <w:t>Performance : FAISS est optimisé pour la recherche de similarité sur de grands</w:t>
+      </w:r>
+      <w:r>
+        <w:t xml:space="preserve"> volumes de données</w:t>
       </w:r>
     </w:p>
     <w:p>
@@ -2957,8 +3628,13 @@
         <w:spacing w:before="60" w:after="60"/>
       </w:pPr>
       <w:r>
-        <w:t>Fonctionnement en local : pas de dépendance à internet après le téléchargement initial</w:t>
-      </w:r>
+        <w:t xml:space="preserve">Intégration : FAISS s'intègre nativement avec </w:t>
+      </w:r>
+      <w:proofErr w:type="spellStart"/>
+      <w:r>
+        <w:t>LangChain</w:t>
+      </w:r>
+      <w:proofErr w:type="spellEnd"/>
     </w:p>
     <w:p>
       <w:pPr>
@@ -2970,10 +3646,7 @@
         <w:spacing w:before="60" w:after="60"/>
       </w:pPr>
       <w:r>
-        <w:t>Légèreté : 90 Mo seulement, adapté à un PO</w:t>
-      </w:r>
-      <w:r>
-        <w:t>C</w:t>
+        <w:t>Algorithme IndexFlatL2 : mesure la distance euclidienne entre les vecteurs, simple et efficace pour un POC</w:t>
       </w:r>
     </w:p>
     <w:p>
@@ -2986,31 +3659,26 @@
         <w:spacing w:before="60" w:after="60"/>
       </w:pPr>
       <w:r>
-        <w:t>Qualité suffisante : 384 dimensions permettent une bonne représentation sémantique en français</w:t>
-      </w:r>
-    </w:p>
-    <w:p>
-      <w:pPr>
-        <w:pStyle w:val="Paragraphedeliste"/>
-        <w:spacing w:before="60" w:after="60"/>
-        <w:ind w:left="720"/>
-      </w:pPr>
+        <w:t>Gratuit et open source : pas de coût supplémentaire</w:t>
+      </w:r>
+    </w:p>
+    <w:p>
+      <w:pPr>
+        <w:spacing w:before="100" w:after="100"/>
+      </w:pPr>
+    </w:p>
+    <w:p>
+      <w:r>
+        <w:br w:type="page"/>
+      </w:r>
     </w:p>
     <w:p>
       <w:pPr>
         <w:pStyle w:val="Titre1"/>
       </w:pPr>
       <w:r>
-        <w:t>5</w:t>
-      </w:r>
-      <w:r>
-        <w:t>. Résultats du P</w:t>
-      </w:r>
-      <w:r>
-        <w:t>O</w:t>
-      </w:r>
-      <w:r>
-        <w:t>C</w:t>
+        <w:lastRenderedPageBreak/>
+        <w:t>5. Résultats du POC</w:t>
       </w:r>
     </w:p>
     <w:p>
@@ -3145,7 +3813,7 @@
                 <w:sz w:val="22"/>
                 <w:szCs w:val="22"/>
               </w:rPr>
-              <w:t>Événements dans la source brute</w:t>
+              <w:t>Événements dans l'API (total France)</w:t>
             </w:r>
           </w:p>
         </w:tc>
@@ -3172,7 +3840,7 @@
                 <w:sz w:val="22"/>
                 <w:szCs w:val="22"/>
               </w:rPr>
-              <w:t>1 152 529</w:t>
+              <w:t>&gt; 1 170 000</w:t>
             </w:r>
           </w:p>
         </w:tc>
@@ -3207,7 +3875,7 @@
                 <w:sz w:val="22"/>
                 <w:szCs w:val="22"/>
               </w:rPr>
-              <w:t>Événements en Gironde</w:t>
+              <w:t>Événements en Gironde (via API)</w:t>
             </w:r>
           </w:p>
         </w:tc>
@@ -3234,7 +3902,7 @@
                 <w:sz w:val="22"/>
                 <w:szCs w:val="22"/>
               </w:rPr>
-              <w:t>50 566</w:t>
+              <w:t>12 943</w:t>
             </w:r>
           </w:p>
         </w:tc>
@@ -3269,7 +3937,7 @@
                 <w:sz w:val="22"/>
                 <w:szCs w:val="22"/>
               </w:rPr>
-              <w:t>Événements de moins d'un an</w:t>
+              <w:t>Passe 1 — Bordeaux</w:t>
             </w:r>
           </w:p>
         </w:tc>
@@ -3296,7 +3964,7 @@
                 <w:sz w:val="22"/>
                 <w:szCs w:val="22"/>
               </w:rPr>
-              <w:t>12 267</w:t>
+              <w:t>6 571</w:t>
             </w:r>
           </w:p>
         </w:tc>
@@ -3331,7 +3999,7 @@
                 <w:sz w:val="22"/>
                 <w:szCs w:val="22"/>
               </w:rPr>
-              <w:t>Événements après nettoyage</w:t>
+              <w:t>Passe 2 — Reste de la Gironde</w:t>
             </w:r>
           </w:p>
         </w:tc>
@@ -3358,7 +4026,7 @@
                 <w:sz w:val="22"/>
                 <w:szCs w:val="22"/>
               </w:rPr>
-              <w:t>12 264</w:t>
+              <w:t>6 367</w:t>
             </w:r>
           </w:p>
         </w:tc>
@@ -3393,7 +4061,7 @@
                 <w:sz w:val="22"/>
                 <w:szCs w:val="22"/>
               </w:rPr>
-              <w:t>Vecteurs dans l'index FAISS</w:t>
+              <w:t>Après déduplication</w:t>
             </w:r>
           </w:p>
         </w:tc>
@@ -3420,7 +4088,7 @@
                 <w:sz w:val="22"/>
                 <w:szCs w:val="22"/>
               </w:rPr>
-              <w:t>12 264</w:t>
+              <w:t>12 872</w:t>
             </w:r>
           </w:p>
         </w:tc>
@@ -3455,6 +4123,130 @@
                 <w:sz w:val="22"/>
                 <w:szCs w:val="22"/>
               </w:rPr>
+              <w:t>Après nettoyage complet</w:t>
+            </w:r>
+          </w:p>
+        </w:tc>
+        <w:tc>
+          <w:tcPr>
+            <w:tcW w:w="4026" w:type="dxa"/>
+            <w:tcBorders>
+              <w:top w:val="single" w:sz="1" w:space="0" w:color="CCCCCC"/>
+              <w:left w:val="single" w:sz="1" w:space="0" w:color="CCCCCC"/>
+              <w:bottom w:val="single" w:sz="1" w:space="0" w:color="CCCCCC"/>
+              <w:right w:val="single" w:sz="1" w:space="0" w:color="CCCCCC"/>
+            </w:tcBorders>
+            <w:shd w:val="clear" w:color="auto" w:fill="FFFFFF"/>
+            <w:tcMar>
+              <w:top w:w="80" w:type="dxa"/>
+              <w:left w:w="120" w:type="dxa"/>
+              <w:bottom w:w="80" w:type="dxa"/>
+              <w:right w:w="120" w:type="dxa"/>
+            </w:tcMar>
+          </w:tcPr>
+          <w:p>
+            <w:r>
+              <w:rPr>
+                <w:sz w:val="22"/>
+                <w:szCs w:val="22"/>
+              </w:rPr>
+              <w:t>12 869</w:t>
+            </w:r>
+          </w:p>
+        </w:tc>
+      </w:tr>
+      <w:tr>
+        <w:tblPrEx>
+          <w:tblCellMar>
+            <w:top w:w="0" w:type="dxa"/>
+            <w:bottom w:w="0" w:type="dxa"/>
+          </w:tblCellMar>
+        </w:tblPrEx>
+        <w:tc>
+          <w:tcPr>
+            <w:tcW w:w="5000" w:type="dxa"/>
+            <w:tcBorders>
+              <w:top w:val="single" w:sz="1" w:space="0" w:color="CCCCCC"/>
+              <w:left w:val="single" w:sz="1" w:space="0" w:color="CCCCCC"/>
+              <w:bottom w:val="single" w:sz="1" w:space="0" w:color="CCCCCC"/>
+              <w:right w:val="single" w:sz="1" w:space="0" w:color="CCCCCC"/>
+            </w:tcBorders>
+            <w:shd w:val="clear" w:color="auto" w:fill="F5F5F5"/>
+            <w:tcMar>
+              <w:top w:w="80" w:type="dxa"/>
+              <w:left w:w="120" w:type="dxa"/>
+              <w:bottom w:w="80" w:type="dxa"/>
+              <w:right w:w="120" w:type="dxa"/>
+            </w:tcMar>
+          </w:tcPr>
+          <w:p>
+            <w:r>
+              <w:rPr>
+                <w:sz w:val="22"/>
+                <w:szCs w:val="22"/>
+              </w:rPr>
+              <w:t>Vecteurs dans l'index FAISS</w:t>
+            </w:r>
+          </w:p>
+        </w:tc>
+        <w:tc>
+          <w:tcPr>
+            <w:tcW w:w="4026" w:type="dxa"/>
+            <w:tcBorders>
+              <w:top w:val="single" w:sz="1" w:space="0" w:color="CCCCCC"/>
+              <w:left w:val="single" w:sz="1" w:space="0" w:color="CCCCCC"/>
+              <w:bottom w:val="single" w:sz="1" w:space="0" w:color="CCCCCC"/>
+              <w:right w:val="single" w:sz="1" w:space="0" w:color="CCCCCC"/>
+            </w:tcBorders>
+            <w:shd w:val="clear" w:color="auto" w:fill="F5F5F5"/>
+            <w:tcMar>
+              <w:top w:w="80" w:type="dxa"/>
+              <w:left w:w="120" w:type="dxa"/>
+              <w:bottom w:w="80" w:type="dxa"/>
+              <w:right w:w="120" w:type="dxa"/>
+            </w:tcMar>
+          </w:tcPr>
+          <w:p>
+            <w:r>
+              <w:rPr>
+                <w:sz w:val="22"/>
+                <w:szCs w:val="22"/>
+              </w:rPr>
+              <w:t>12 869</w:t>
+            </w:r>
+          </w:p>
+        </w:tc>
+      </w:tr>
+      <w:tr>
+        <w:tblPrEx>
+          <w:tblCellMar>
+            <w:top w:w="0" w:type="dxa"/>
+            <w:bottom w:w="0" w:type="dxa"/>
+          </w:tblCellMar>
+        </w:tblPrEx>
+        <w:tc>
+          <w:tcPr>
+            <w:tcW w:w="5000" w:type="dxa"/>
+            <w:tcBorders>
+              <w:top w:val="single" w:sz="1" w:space="0" w:color="CCCCCC"/>
+              <w:left w:val="single" w:sz="1" w:space="0" w:color="CCCCCC"/>
+              <w:bottom w:val="single" w:sz="1" w:space="0" w:color="CCCCCC"/>
+              <w:right w:val="single" w:sz="1" w:space="0" w:color="CCCCCC"/>
+            </w:tcBorders>
+            <w:shd w:val="clear" w:color="auto" w:fill="FFFFFF"/>
+            <w:tcMar>
+              <w:top w:w="80" w:type="dxa"/>
+              <w:left w:w="120" w:type="dxa"/>
+              <w:bottom w:w="80" w:type="dxa"/>
+              <w:right w:w="120" w:type="dxa"/>
+            </w:tcMar>
+          </w:tcPr>
+          <w:p>
+            <w:r>
+              <w:rPr>
+                <w:sz w:val="22"/>
+                <w:szCs w:val="22"/>
+              </w:rPr>
               <w:t>Dimensions par vecteur</w:t>
             </w:r>
           </w:p>
@@ -3495,45 +4287,9 @@
     </w:p>
     <w:p>
       <w:pPr>
-        <w:spacing w:before="100" w:after="100"/>
-      </w:pPr>
-    </w:p>
-    <w:p>
-      <w:pPr>
-        <w:spacing w:before="100" w:after="100"/>
-      </w:pPr>
-    </w:p>
-    <w:p>
-      <w:pPr>
-        <w:spacing w:before="100" w:after="100"/>
-      </w:pPr>
-    </w:p>
-    <w:p>
-      <w:pPr>
-        <w:spacing w:before="100" w:after="100"/>
-      </w:pPr>
-    </w:p>
-    <w:p>
-      <w:pPr>
-        <w:spacing w:before="100" w:after="100"/>
-      </w:pPr>
-    </w:p>
-    <w:p>
-      <w:pPr>
-        <w:spacing w:before="100" w:after="100"/>
-      </w:pPr>
-    </w:p>
-    <w:p>
-      <w:pPr>
-        <w:spacing w:before="100" w:after="100"/>
-      </w:pPr>
-    </w:p>
-    <w:p>
-      <w:pPr>
         <w:pStyle w:val="Titre2"/>
       </w:pPr>
       <w:r>
-        <w:lastRenderedPageBreak/>
         <w:t>5.2 Tests unitaires</w:t>
       </w:r>
     </w:p>
@@ -4523,7 +5279,7 @@
       </w:r>
       <w:proofErr w:type="spellEnd"/>
       <w:r>
-        <w:t>. Une réponse est considérée correcte si elle a le même sens et contient les mêmes informations clés que la réponse annotée par l'humain.</w:t>
+        <w:t>. Une réponse est considérée correcte si elle a le même sens et contient les mêmes informations clés que la réponse annotée.</w:t>
       </w:r>
     </w:p>
     <w:p>
@@ -4586,17 +5342,7 @@
                 <w:sz w:val="22"/>
                 <w:szCs w:val="22"/>
               </w:rPr>
-              <w:t>Que</w:t>
-            </w:r>
-            <w:r>
-              <w:rPr>
-                <w:b/>
-                <w:bCs/>
-                <w:color w:val="FFFFFF"/>
-                <w:sz w:val="22"/>
-                <w:szCs w:val="22"/>
-              </w:rPr>
-              <w:t>stion</w:t>
+              <w:t>Question</w:t>
             </w:r>
           </w:p>
         </w:tc>
@@ -4626,7 +5372,17 @@
                 <w:sz w:val="22"/>
                 <w:szCs w:val="22"/>
               </w:rPr>
-              <w:t>Résultat</w:t>
+              <w:t>Résulta</w:t>
+            </w:r>
+            <w:r>
+              <w:rPr>
+                <w:b/>
+                <w:bCs/>
+                <w:color w:val="FFFFFF"/>
+                <w:sz w:val="22"/>
+                <w:szCs w:val="22"/>
+              </w:rPr>
+              <w:t>t</w:t>
             </w:r>
           </w:p>
         </w:tc>
@@ -4691,6 +5447,7 @@
                 <w:sz w:val="22"/>
                 <w:szCs w:val="22"/>
               </w:rPr>
+              <w:lastRenderedPageBreak/>
               <w:t>Y a-t-il des concerts à venir à Bordeaux ?</w:t>
             </w:r>
           </w:p>
@@ -4745,7 +5502,7 @@
                 <w:sz w:val="22"/>
                 <w:szCs w:val="22"/>
               </w:rPr>
-              <w:t>2 concerts trouvés avec titres, lieux et dates</w:t>
+              <w:t>2 concerts avec titres, lieux et dates</w:t>
             </w:r>
           </w:p>
         </w:tc>
@@ -4834,7 +5591,7 @@
                 <w:sz w:val="22"/>
                 <w:szCs w:val="22"/>
               </w:rPr>
-              <w:t>Festival Un Été au Grand Parc trouvé avec détails</w:t>
+              <w:t>Festival Un Été au Grand Parc trouvé</w:t>
             </w:r>
           </w:p>
         </w:tc>
@@ -4923,7 +5680,7 @@
                 <w:sz w:val="22"/>
                 <w:szCs w:val="22"/>
               </w:rPr>
-              <w:t>2 expositions trouvées avec titres et lieux</w:t>
+              <w:t>2 expositions avec titres et lieux</w:t>
             </w:r>
           </w:p>
         </w:tc>
@@ -4958,7 +5715,7 @@
                 <w:sz w:val="22"/>
                 <w:szCs w:val="22"/>
               </w:rPr>
-              <w:t>Quels événements culturels sont gratuits en Gironde ?</w:t>
+              <w:t>Quels événements culturels sont gratuits ?</w:t>
             </w:r>
           </w:p>
         </w:tc>
@@ -5012,7 +5769,7 @@
                 <w:sz w:val="22"/>
                 <w:szCs w:val="22"/>
               </w:rPr>
-              <w:t>2 événements gratuits identifiés correctement</w:t>
+              <w:t>2 événements gratuits identifiés</w:t>
             </w:r>
           </w:p>
         </w:tc>
@@ -5042,23 +5799,12 @@
             </w:tcMar>
           </w:tcPr>
           <w:p>
-            <w:proofErr w:type="spellStart"/>
-            <w:proofErr w:type="gramStart"/>
-            <w:r>
-              <w:rPr>
-                <w:sz w:val="22"/>
-                <w:szCs w:val="22"/>
-              </w:rPr>
-              <w:t>Donne moi</w:t>
-            </w:r>
-            <w:proofErr w:type="spellEnd"/>
-            <w:proofErr w:type="gramEnd"/>
-            <w:r>
-              <w:rPr>
-                <w:sz w:val="22"/>
-                <w:szCs w:val="22"/>
-              </w:rPr>
-              <w:t xml:space="preserve"> le nombre d'événements 2026 déjà passés ?</w:t>
+            <w:r>
+              <w:rPr>
+                <w:sz w:val="22"/>
+                <w:szCs w:val="22"/>
+              </w:rPr>
+              <w:t>Nombre d'événements 2026 déjà passés ?</w:t>
             </w:r>
           </w:p>
         </w:tc>
@@ -5112,23 +5858,7 @@
                 <w:sz w:val="22"/>
                 <w:szCs w:val="22"/>
               </w:rPr>
-              <w:t xml:space="preserve">Le </w:t>
-            </w:r>
-            <w:proofErr w:type="spellStart"/>
-            <w:r>
-              <w:rPr>
-                <w:sz w:val="22"/>
-                <w:szCs w:val="22"/>
-              </w:rPr>
-              <w:t>chatbot</w:t>
-            </w:r>
-            <w:proofErr w:type="spellEnd"/>
-            <w:r>
-              <w:rPr>
-                <w:sz w:val="22"/>
-                <w:szCs w:val="22"/>
-              </w:rPr>
-              <w:t xml:space="preserve"> précise correctement sa limitation</w:t>
+              <w:t>Limitation correctement expliquée</w:t>
             </w:r>
           </w:p>
         </w:tc>
@@ -5155,16 +5885,10 @@
     </w:p>
     <w:p>
       <w:pPr>
-        <w:spacing w:before="100" w:after="100"/>
-      </w:pPr>
-    </w:p>
-    <w:p>
-      <w:pPr>
         <w:pStyle w:val="Titre2"/>
       </w:pPr>
       <w:r>
-        <w:lastRenderedPageBreak/>
-        <w:t xml:space="preserve">5.4 Exemples de réponses du </w:t>
+        <w:t xml:space="preserve">5.4 Exemple de réponse du </w:t>
       </w:r>
       <w:proofErr w:type="spellStart"/>
       <w:r>
@@ -5199,17 +5923,7 @@
           <w:sz w:val="22"/>
           <w:szCs w:val="22"/>
         </w:rPr>
-        <w:t xml:space="preserve">Oui, il y a des concerts à venir à Bordeaux ! 1. "Ici, là-bas" </w:t>
-      </w:r>
-      <w:r>
-        <w:rPr>
-          <w:i/>
-          <w:iCs/>
-          <w:color w:val="444444"/>
-          <w:sz w:val="22"/>
-          <w:szCs w:val="22"/>
-        </w:rPr>
-        <w:t xml:space="preserve">– Un concert pour les tout-petits par la Compagnie </w:t>
+        <w:t xml:space="preserve">Oui, il y a des concerts à venir à Bordeaux ! 1. "Ici, là-bas" – Un concert pour les tout-petits par la Compagnie </w:t>
       </w:r>
       <w:proofErr w:type="spellStart"/>
       <w:r>
@@ -5231,7 +5945,17 @@
           <w:sz w:val="22"/>
           <w:szCs w:val="22"/>
         </w:rPr>
-        <w:t>. Les 6 et 7 février 2027 au Grand Théâtre - Foyer rouge. 2. "Concert du dimanche" – Thème clair-obscur romantique, le 4 avril 2027 à l'Auditorium de Bordeaux.</w:t>
+        <w:t>. Les 6 et 7 février 2027 au Grand Théâtre - Foyer rouge. 2. "Concert du</w:t>
+      </w:r>
+      <w:r>
+        <w:rPr>
+          <w:i/>
+          <w:iCs/>
+          <w:color w:val="444444"/>
+          <w:sz w:val="22"/>
+          <w:szCs w:val="22"/>
+        </w:rPr>
+        <w:t xml:space="preserve"> dimanche" – Thème clair-obscur romantique, le 4 avril 2027 à l'Auditorium de Bordeaux.</w:t>
       </w:r>
     </w:p>
     <w:p>
@@ -5259,16 +5983,13 @@
         </w:numPr>
         <w:spacing w:before="60" w:after="60"/>
       </w:pPr>
-      <w:r>
-        <w:t xml:space="preserve">Mise à jour automatique des données : mettre en place un </w:t>
-      </w:r>
       <w:proofErr w:type="spellStart"/>
       <w:r>
-        <w:t>scheduler</w:t>
+        <w:t>Scheduler</w:t>
       </w:r>
       <w:proofErr w:type="spellEnd"/>
       <w:r>
-        <w:t xml:space="preserve"> pour récupérer régulièrement les nouveaux événements depuis Open Agenda</w:t>
+        <w:t xml:space="preserve"> de mise à jour : automatiser l'appel à l'API Open Agenda régulièrement pour garder les données fraîches</w:t>
       </w:r>
     </w:p>
     <w:p>
@@ -5281,10 +6002,7 @@
         <w:spacing w:before="60" w:after="60"/>
       </w:pPr>
       <w:r>
-        <w:t>Injection de la date du jour dans le prompt : Mistral ne connaît pas la date actuelle, ce qui peut entraîner des conf</w:t>
-      </w:r>
-      <w:r>
-        <w:t>usions temporelles dans les réponses</w:t>
+        <w:t>Injection de la date du jour dans le prompt : Mistral ne connaît pas la date actuelle, ce qui peut entraîner des confusions temporelles</w:t>
       </w:r>
     </w:p>
     <w:p>
@@ -5297,7 +6015,10 @@
         <w:spacing w:before="60" w:after="60"/>
       </w:pPr>
       <w:r>
-        <w:t xml:space="preserve">Utilisation de Mistral </w:t>
+        <w:t>Utilis</w:t>
+      </w:r>
+      <w:r>
+        <w:t xml:space="preserve">ation de Mistral </w:t>
       </w:r>
       <w:proofErr w:type="spellStart"/>
       <w:r>
@@ -5313,15 +6034,7 @@
       </w:r>
       <w:proofErr w:type="spellEnd"/>
       <w:r>
-        <w:t xml:space="preserve"> pour une meilleure cohérence entre le modèle d'</w:t>
-      </w:r>
-      <w:proofErr w:type="spellStart"/>
-      <w:r>
-        <w:t>embedding</w:t>
-      </w:r>
-      <w:proofErr w:type="spellEnd"/>
-      <w:r>
-        <w:t xml:space="preserve"> et le modèle de génération</w:t>
+        <w:t xml:space="preserve"> pour une meilleure cohérence avec le modèle de génération</w:t>
       </w:r>
     </w:p>
     <w:p>
@@ -5334,10 +6047,7 @@
         <w:spacing w:before="60" w:after="60"/>
       </w:pPr>
       <w:r>
-        <w:t>Historique de conversation : ajouter un suivi de l'h</w:t>
-      </w:r>
-      <w:r>
-        <w:t>istorique pour des échanges plus naturels et contextualisés</w:t>
+        <w:t>Historique de conversation : ajouter un suivi de l'historique pour des échanges plus naturels</w:t>
       </w:r>
     </w:p>
     <w:p>
@@ -5350,7 +6060,10 @@
         <w:spacing w:before="60" w:after="60"/>
       </w:pPr>
       <w:r>
-        <w:t>Augmentation du nombre de candidats FAISS : passer de 25 à 50 candidats avant le filtre de date pour améliorer le rappel</w:t>
+        <w:t>Augmentation du nombre de c</w:t>
+      </w:r>
+      <w:r>
+        <w:t>andidats FAISS : passer de 25 à 50 candidats avant le filtre de date pour améliorer le rappel</w:t>
       </w:r>
     </w:p>
     <w:p>
@@ -5384,10 +6097,7 @@
       </w:r>
       <w:proofErr w:type="spellEnd"/>
       <w:r>
-        <w:t xml:space="preserve"> sur u</w:t>
-      </w:r>
-      <w:r>
-        <w:t>ne interface web (</w:t>
+        <w:t xml:space="preserve"> sur une interface web (</w:t>
       </w:r>
       <w:proofErr w:type="spellStart"/>
       <w:r>
@@ -5403,7 +6113,7 @@
       </w:r>
       <w:proofErr w:type="spellEnd"/>
       <w:r>
-        <w:t>) pour une utilisation plus intuitive</w:t>
+        <w:t>) pour une utilisation grand public</w:t>
       </w:r>
     </w:p>
     <w:p>
@@ -5416,7 +6126,11 @@
         <w:spacing w:before="60" w:after="60"/>
       </w:pPr>
       <w:r>
-        <w:t>Filtres utilisateur : permettre à l'utilisateur de filtrer par ville, date, catégorie directement dans l'interface</w:t>
+        <w:lastRenderedPageBreak/>
+        <w:t>Filtres utilisa</w:t>
+      </w:r>
+      <w:r>
+        <w:t>teur : permettre à l'utilisateur de filtrer par ville, date, catégorie directement dans l'interface</w:t>
       </w:r>
     </w:p>
     <w:p>
@@ -5429,10 +6143,7 @@
         <w:spacing w:before="60" w:after="60"/>
       </w:pPr>
       <w:r>
-        <w:t>Évaluation automatique : mettre en place un système d'évaluation au</w:t>
-      </w:r>
-      <w:r>
-        <w:t>tomatique des réponses basé sur le jeu de données annoté</w:t>
+        <w:t>Extension géographique : étendre le périmètre à toute la Nouvelle-Aquitaine</w:t>
       </w:r>
     </w:p>
     <w:p>
@@ -5445,7 +6156,7 @@
         <w:spacing w:before="60" w:after="60"/>
       </w:pPr>
       <w:r>
-        <w:t>Extension géographique : étendre le périmètre à toute la Nouvelle-Aquitaine</w:t>
+        <w:t>Évaluation automatique : système d'évaluation basé sur le jeu de données annoté</w:t>
       </w:r>
     </w:p>
     <w:p>
@@ -5479,10 +6190,7 @@
       </w:r>
       <w:proofErr w:type="spellEnd"/>
       <w:r>
-        <w:t xml:space="preserve"> pour des performances optimales sur de très grands volumes </w:t>
-      </w:r>
-      <w:r>
-        <w:t>de données</w:t>
+        <w:t xml:space="preserve"> pour des performances optimales sur de très grands volumes</w:t>
       </w:r>
     </w:p>
     <w:p>
@@ -5508,25 +6216,18 @@
         <w:spacing w:before="60" w:after="60"/>
       </w:pPr>
       <w:r>
-        <w:t>Containeriser l'application avec Docker pour faciliter le déploiement</w:t>
-      </w:r>
-    </w:p>
-    <w:p>
-      <w:pPr>
-        <w:spacing w:before="100" w:after="100"/>
-      </w:pPr>
-    </w:p>
-    <w:p>
-      <w:r>
-        <w:br w:type="page"/>
-      </w:r>
-    </w:p>
+        <w:t>Containeriser l'application avec Docker pour faciliter le déploiemen</w:t>
+      </w:r>
+      <w:r>
+        <w:t>t</w:t>
+      </w:r>
+    </w:p>
+    <w:p/>
     <w:p>
       <w:pPr>
         <w:pStyle w:val="Titre1"/>
       </w:pPr>
       <w:r>
-        <w:lastRenderedPageBreak/>
         <w:t>7. Conclusion</w:t>
       </w:r>
     </w:p>
@@ -5536,10 +6237,10 @@
         <w:jc w:val="both"/>
       </w:pPr>
       <w:r>
-        <w:t>Ce Proof of Concept démontre la faisabilité d'un système RAG pour la recommandation d'événeme</w:t>
-      </w:r>
-      <w:r>
-        <w:t>nts culturels en Gironde. Le système est capable de répondre à des questions en langage naturel en s'appuyant sur une base de données vectorielle de 12 264 événements réels.</w:t>
+        <w:t>Ce Proof of Concept démontre la faisabilité d'un système RAG pour la recommandation d'événements culturels en Gironde. Le système est capable de répondre à des questions en langage naturel en s'appuyant sur une base de données vectoriell</w:t>
+      </w:r>
+      <w:r>
+        <w:t>e de 12 869 événements récupérés en temps réel via l'API Open Agenda.</w:t>
       </w:r>
     </w:p>
     <w:p>
@@ -5553,34 +6254,10 @@
         <w:jc w:val="both"/>
       </w:pPr>
       <w:r>
-        <w:t>Les technologies choisies (</w:t>
-      </w:r>
-      <w:proofErr w:type="spellStart"/>
-      <w:r>
-        <w:t>LangChain</w:t>
-      </w:r>
-      <w:proofErr w:type="spellEnd"/>
-      <w:r>
-        <w:t xml:space="preserve">, FAISS, Mistral AI, </w:t>
-      </w:r>
-      <w:proofErr w:type="spellStart"/>
-      <w:r>
-        <w:t>SentenceTransformers</w:t>
-      </w:r>
-      <w:proofErr w:type="spellEnd"/>
-      <w:r>
-        <w:t>) fo</w:t>
-      </w:r>
-      <w:r>
-        <w:t xml:space="preserve">rment </w:t>
-      </w:r>
-      <w:proofErr w:type="gramStart"/>
-      <w:r>
-        <w:t>une stack cohérente</w:t>
-      </w:r>
-      <w:proofErr w:type="gramEnd"/>
-      <w:r>
-        <w:t>, moderne et économique, adaptée à un POC. Les 8 tests unitaires valident la qualité des données traitées et le jeu de données annoté confirme un score de 5/5 sur les questions de test.</w:t>
+        <w:t>L'adoption de l'API Open Agenda représente une amélioration significative par rapport à l'approche initiale basée sur un fichier JSON statique de 4,6 Go. Elle garantit des données fraîc</w:t>
+      </w:r>
+      <w:r>
+        <w:t>hes à chaque exécution du pipeline et élimine le besoin de stocker un fichier volumineux en local.</w:t>
       </w:r>
     </w:p>
     <w:p>
@@ -5594,21 +6271,34 @@
         <w:jc w:val="both"/>
       </w:pPr>
       <w:r>
-        <w:t>Un processus de nettoyage rigoureux a été mi</w:t>
-      </w:r>
-      <w:r>
-        <w:t>s en place pour garantir la qualité des données : suppression des balises HTML, correction des caractères mal encodés, normalisation des sauts de ligne et tabulations. Ce nettoyage est appliqué dès la lecture du JSON source et complété lors du pré-</w:t>
+        <w:t>Les technologies choisies (</w:t>
       </w:r>
       <w:proofErr w:type="spellStart"/>
       <w:r>
-        <w:t>processi</w:t>
-      </w:r>
-      <w:r>
-        <w:t>ng</w:t>
+        <w:t>LangChain</w:t>
       </w:r>
       <w:proofErr w:type="spellEnd"/>
       <w:r>
-        <w:t>.</w:t>
+        <w:t xml:space="preserve">, FAISS, Mistral AI, </w:t>
+      </w:r>
+      <w:proofErr w:type="spellStart"/>
+      <w:r>
+        <w:t>SentenceTransformers</w:t>
+      </w:r>
+      <w:proofErr w:type="spellEnd"/>
+      <w:r>
+        <w:t xml:space="preserve">) forment </w:t>
+      </w:r>
+      <w:proofErr w:type="gramStart"/>
+      <w:r>
+        <w:t>une stack cohérente</w:t>
+      </w:r>
+      <w:proofErr w:type="gramEnd"/>
+      <w:r>
+        <w:t>, moderne et économique. Les 8 tests unitaires val</w:t>
+      </w:r>
+      <w:r>
+        <w:t>ident la qualité des données traitées et le jeu de données annoté confirme un score de 5/5 sur les questions de test.</w:t>
       </w:r>
     </w:p>
     <w:p>
@@ -5622,7 +6312,10 @@
         <w:jc w:val="both"/>
       </w:pPr>
       <w:r>
-        <w:t>Les recommandations formulées constituent une feuille de route claire pour le passage en production d'une version complète et robuste du système.</w:t>
+        <w:t>Un processus de nettoyage rigoureux garantit la qualité des données : suppression des balises HTML, correction des caractères mal encodés</w:t>
+      </w:r>
+      <w:r>
+        <w:t>, normalisation des sauts de ligne. Les recommandations formulées constituent une feuille de route claire pour le passage en production.</w:t>
       </w:r>
     </w:p>
     <w:sectPr>
@@ -5638,10 +6331,96 @@
 <file path=word/numbering.xml><?xml version="1.0" encoding="utf-8"?>
 <w:numbering xmlns:wpc="http://schemas.microsoft.com/office/word/2010/wordprocessingCanvas" xmlns:cx="http://schemas.microsoft.com/office/drawing/2014/chartex" xmlns:cx1="http://schemas.microsoft.com/office/drawing/2015/9/8/chartex" xmlns:cx2="http://schemas.microsoft.com/office/drawing/2015/10/21/chartex" xmlns:cx3="http://schemas.microsoft.com/office/drawing/2016/5/9/chartex" xmlns:cx4="http://schemas.microsoft.com/office/drawing/2016/5/10/chartex" xmlns:cx5="http://schemas.microsoft.com/office/drawing/2016/5/11/chartex" xmlns:cx6="http://schemas.microsoft.com/office/drawing/2016/5/12/chartex" xmlns:cx7="http://schemas.microsoft.com/office/drawing/2016/5/13/chartex" xmlns:cx8="http://schemas.microsoft.com/office/drawing/2016/5/14/chartex" xmlns:mc="http://schemas.openxmlformats.org/markup-compatibility/2006" xmlns:aink="http://schemas.microsoft.com/office/drawing/2016/ink" xmlns:am3d="http://schemas.microsoft.com/office/drawing/2017/model3d" xmlns:o="urn:schemas-microsoft-com:office:office" xmlns:r="http://schemas.openxmlformats.org/officeDocument/2006/relationships" xmlns:m="http://schemas.openxmlformats.org/officeDocument/2006/math" xmlns:v="urn:schemas-microsoft-com:vml" xmlns:wp14="http://schemas.microsoft.com/office/word/2010/wordprocessingDrawing" xmlns:wp="http://schemas.openxmlformats.org/drawingml/2006/wordprocessingDrawing" xmlns:w10="urn:schemas-microsoft-com:office:word" xmlns:w="http://schemas.openxmlformats.org/wordprocessingml/2006/main" xmlns:w14="http://schemas.microsoft.com/office/word/2010/wordml" xmlns:w15="http://schemas.microsoft.com/office/word/2012/wordml" xmlns:w16cex="http://schemas.microsoft.com/office/word/2018/wordml/cex" xmlns:w16cid="http://schemas.microsoft.com/office/word/2016/wordml/cid" xmlns:w16="http://schemas.microsoft.com/office/word/2018/wordml" xmlns:w16sdtdh="http://schemas.microsoft.com/office/word/2020/wordml/sdtdatahash" xmlns:w16se="http://schemas.microsoft.com/office/word/2015/wordml/symex" xmlns:wpg="http://schemas.microsoft.com/office/word/2010/wordprocessingGroup" xmlns:wpi="http://schemas.microsoft.com/office/word/2010/wordprocessingInk" xmlns:wne="http://schemas.microsoft.com/office/word/2006/wordml" xmlns:wps="http://schemas.microsoft.com/office/word/2010/wordprocessingShape" mc:Ignorable="w14 w15 w16se w16cid w16 w16cex w16sdtdh wp14">
   <w:abstractNum w:abstractNumId="0" w15:restartNumberingAfterBreak="0">
-    <w:nsid w:val="522F1CDD"/>
+    <w:nsid w:val="10D15948"/>
     <w:multiLevelType w:val="hybridMultilevel"/>
-    <w:tmpl w:val="EA0EADD0"/>
-    <w:lvl w:ilvl="0" w:tplc="AA5AED9C">
+    <w:tmpl w:val="E84C2A20"/>
+    <w:lvl w:ilvl="0" w:tplc="63F89B42">
+      <w:start w:val="1"/>
+      <w:numFmt w:val="bullet"/>
+      <w:lvlText w:val="●"/>
+      <w:lvlJc w:val="left"/>
+      <w:pPr>
+        <w:ind w:left="720" w:hanging="360"/>
+      </w:pPr>
+    </w:lvl>
+    <w:lvl w:ilvl="1" w:tplc="9ADEB932">
+      <w:start w:val="1"/>
+      <w:numFmt w:val="bullet"/>
+      <w:lvlText w:val="○"/>
+      <w:lvlJc w:val="left"/>
+      <w:pPr>
+        <w:ind w:left="1440" w:hanging="360"/>
+      </w:pPr>
+    </w:lvl>
+    <w:lvl w:ilvl="2" w:tplc="65EC96E0">
+      <w:start w:val="1"/>
+      <w:numFmt w:val="bullet"/>
+      <w:lvlText w:val="■"/>
+      <w:lvlJc w:val="left"/>
+      <w:pPr>
+        <w:ind w:left="2160" w:hanging="360"/>
+      </w:pPr>
+    </w:lvl>
+    <w:lvl w:ilvl="3" w:tplc="94F4D93A">
+      <w:start w:val="1"/>
+      <w:numFmt w:val="bullet"/>
+      <w:lvlText w:val="●"/>
+      <w:lvlJc w:val="left"/>
+      <w:pPr>
+        <w:ind w:left="2880" w:hanging="360"/>
+      </w:pPr>
+    </w:lvl>
+    <w:lvl w:ilvl="4" w:tplc="1FAA24C8">
+      <w:start w:val="1"/>
+      <w:numFmt w:val="bullet"/>
+      <w:lvlText w:val="○"/>
+      <w:lvlJc w:val="left"/>
+      <w:pPr>
+        <w:ind w:left="3600" w:hanging="360"/>
+      </w:pPr>
+    </w:lvl>
+    <w:lvl w:ilvl="5" w:tplc="77AC62BA">
+      <w:start w:val="1"/>
+      <w:numFmt w:val="bullet"/>
+      <w:lvlText w:val="■"/>
+      <w:lvlJc w:val="left"/>
+      <w:pPr>
+        <w:ind w:left="4320" w:hanging="360"/>
+      </w:pPr>
+    </w:lvl>
+    <w:lvl w:ilvl="6" w:tplc="1752F496">
+      <w:start w:val="1"/>
+      <w:numFmt w:val="bullet"/>
+      <w:lvlText w:val="●"/>
+      <w:lvlJc w:val="left"/>
+      <w:pPr>
+        <w:ind w:left="5040" w:hanging="360"/>
+      </w:pPr>
+    </w:lvl>
+    <w:lvl w:ilvl="7" w:tplc="E4CE4E36">
+      <w:start w:val="1"/>
+      <w:numFmt w:val="bullet"/>
+      <w:lvlText w:val="●"/>
+      <w:lvlJc w:val="left"/>
+      <w:pPr>
+        <w:ind w:left="5760" w:hanging="360"/>
+      </w:pPr>
+    </w:lvl>
+    <w:lvl w:ilvl="8" w:tplc="CED66F9C">
+      <w:start w:val="1"/>
+      <w:numFmt w:val="bullet"/>
+      <w:lvlText w:val="●"/>
+      <w:lvlJc w:val="left"/>
+      <w:pPr>
+        <w:ind w:left="6480" w:hanging="360"/>
+      </w:pPr>
+    </w:lvl>
+  </w:abstractNum>
+  <w:abstractNum w:abstractNumId="1" w15:restartNumberingAfterBreak="0">
+    <w:nsid w:val="1B732EE0"/>
+    <w:multiLevelType w:val="hybridMultilevel"/>
+    <w:tmpl w:val="0C325B46"/>
+    <w:lvl w:ilvl="0" w:tplc="F356C896">
       <w:start w:val="1"/>
       <w:numFmt w:val="bullet"/>
       <w:lvlText w:val="•"/>
@@ -5650,141 +6429,55 @@
         <w:ind w:left="720" w:hanging="360"/>
       </w:pPr>
     </w:lvl>
-    <w:lvl w:ilvl="1" w:tplc="018E0938">
+    <w:lvl w:ilvl="1" w:tplc="B692A1F0">
       <w:numFmt w:val="decimal"/>
       <w:lvlText w:val=""/>
       <w:lvlJc w:val="left"/>
     </w:lvl>
-    <w:lvl w:ilvl="2" w:tplc="0D46AA30">
+    <w:lvl w:ilvl="2" w:tplc="03DEDF60">
       <w:numFmt w:val="decimal"/>
       <w:lvlText w:val=""/>
       <w:lvlJc w:val="left"/>
     </w:lvl>
-    <w:lvl w:ilvl="3" w:tplc="99549576">
+    <w:lvl w:ilvl="3" w:tplc="03E0EAD4">
       <w:numFmt w:val="decimal"/>
       <w:lvlText w:val=""/>
       <w:lvlJc w:val="left"/>
     </w:lvl>
-    <w:lvl w:ilvl="4" w:tplc="5EAAFF1A">
+    <w:lvl w:ilvl="4" w:tplc="8FE01B5A">
       <w:numFmt w:val="decimal"/>
       <w:lvlText w:val=""/>
       <w:lvlJc w:val="left"/>
     </w:lvl>
-    <w:lvl w:ilvl="5" w:tplc="1B641DD0">
+    <w:lvl w:ilvl="5" w:tplc="D464A2D0">
       <w:numFmt w:val="decimal"/>
       <w:lvlText w:val=""/>
       <w:lvlJc w:val="left"/>
     </w:lvl>
-    <w:lvl w:ilvl="6" w:tplc="23EA3A40">
+    <w:lvl w:ilvl="6" w:tplc="B4A80CCA">
       <w:numFmt w:val="decimal"/>
       <w:lvlText w:val=""/>
       <w:lvlJc w:val="left"/>
     </w:lvl>
-    <w:lvl w:ilvl="7" w:tplc="1C0E9112">
+    <w:lvl w:ilvl="7" w:tplc="1EF03C0A">
       <w:numFmt w:val="decimal"/>
       <w:lvlText w:val=""/>
       <w:lvlJc w:val="left"/>
     </w:lvl>
-    <w:lvl w:ilvl="8" w:tplc="09A0C13C">
+    <w:lvl w:ilvl="8" w:tplc="C450DFDE">
       <w:numFmt w:val="decimal"/>
       <w:lvlText w:val=""/>
       <w:lvlJc w:val="left"/>
     </w:lvl>
   </w:abstractNum>
-  <w:abstractNum w:abstractNumId="1" w15:restartNumberingAfterBreak="0">
-    <w:nsid w:val="65D84A5D"/>
-    <w:multiLevelType w:val="hybridMultilevel"/>
-    <w:tmpl w:val="51161482"/>
-    <w:lvl w:ilvl="0" w:tplc="3CE22062">
-      <w:start w:val="1"/>
-      <w:numFmt w:val="bullet"/>
-      <w:lvlText w:val="●"/>
-      <w:lvlJc w:val="left"/>
-      <w:pPr>
-        <w:ind w:left="720" w:hanging="360"/>
-      </w:pPr>
-    </w:lvl>
-    <w:lvl w:ilvl="1" w:tplc="AE3485A4">
-      <w:start w:val="1"/>
-      <w:numFmt w:val="bullet"/>
-      <w:lvlText w:val="○"/>
-      <w:lvlJc w:val="left"/>
-      <w:pPr>
-        <w:ind w:left="1440" w:hanging="360"/>
-      </w:pPr>
-    </w:lvl>
-    <w:lvl w:ilvl="2" w:tplc="56D0DC48">
-      <w:start w:val="1"/>
-      <w:numFmt w:val="bullet"/>
-      <w:lvlText w:val="■"/>
-      <w:lvlJc w:val="left"/>
-      <w:pPr>
-        <w:ind w:left="2160" w:hanging="360"/>
-      </w:pPr>
-    </w:lvl>
-    <w:lvl w:ilvl="3" w:tplc="6058897A">
-      <w:start w:val="1"/>
-      <w:numFmt w:val="bullet"/>
-      <w:lvlText w:val="●"/>
-      <w:lvlJc w:val="left"/>
-      <w:pPr>
-        <w:ind w:left="2880" w:hanging="360"/>
-      </w:pPr>
-    </w:lvl>
-    <w:lvl w:ilvl="4" w:tplc="B8F8B178">
-      <w:start w:val="1"/>
-      <w:numFmt w:val="bullet"/>
-      <w:lvlText w:val="○"/>
-      <w:lvlJc w:val="left"/>
-      <w:pPr>
-        <w:ind w:left="3600" w:hanging="360"/>
-      </w:pPr>
-    </w:lvl>
-    <w:lvl w:ilvl="5" w:tplc="FFE46A0C">
-      <w:start w:val="1"/>
-      <w:numFmt w:val="bullet"/>
-      <w:lvlText w:val="■"/>
-      <w:lvlJc w:val="left"/>
-      <w:pPr>
-        <w:ind w:left="4320" w:hanging="360"/>
-      </w:pPr>
-    </w:lvl>
-    <w:lvl w:ilvl="6" w:tplc="F0523274">
-      <w:start w:val="1"/>
-      <w:numFmt w:val="bullet"/>
-      <w:lvlText w:val="●"/>
-      <w:lvlJc w:val="left"/>
-      <w:pPr>
-        <w:ind w:left="5040" w:hanging="360"/>
-      </w:pPr>
-    </w:lvl>
-    <w:lvl w:ilvl="7" w:tplc="156EA254">
-      <w:start w:val="1"/>
-      <w:numFmt w:val="bullet"/>
-      <w:lvlText w:val="●"/>
-      <w:lvlJc w:val="left"/>
-      <w:pPr>
-        <w:ind w:left="5760" w:hanging="360"/>
-      </w:pPr>
-    </w:lvl>
-    <w:lvl w:ilvl="8" w:tplc="1470819C">
-      <w:start w:val="1"/>
-      <w:numFmt w:val="bullet"/>
-      <w:lvlText w:val="●"/>
-      <w:lvlJc w:val="left"/>
-      <w:pPr>
-        <w:ind w:left="6480" w:hanging="360"/>
-      </w:pPr>
-    </w:lvl>
-  </w:abstractNum>
   <w:num w:numId="1">
-    <w:abstractNumId w:val="1"/>
+    <w:abstractNumId w:val="0"/>
     <w:lvlOverride w:ilvl="0">
       <w:startOverride w:val="1"/>
     </w:lvlOverride>
   </w:num>
   <w:num w:numId="2">
-    <w:abstractNumId w:val="0"/>
+    <w:abstractNumId w:val="1"/>
     <w:lvlOverride w:ilvl="0">
       <w:startOverride w:val="1"/>
     </w:lvlOverride>

</xml_diff>